<commit_message>
Parte teorica do grupo completa
- Adiciona a Parte 1 e 2 com a pesquisa teórica, tabelas comparativas e experimentos práticos dos algoritmos Bubble Sort e Quick Sort.
- Documenta a Parte 3 com as análises de busca sequencial em matrizes.
- Registra a Parte 4 com o Hands On de investigação e percurso de arrays de temperatura.
- Inclui a Parte 5 com o código em C de monitoramento de sensores via matrizes e contagem de limites.
- Finaliza com a Parte 6 contendo a análise crítica, o comparativo de complexidade O(n²) vs O(n log n) e a conclusão geral do trabalho.
</commit_message>
<xml_diff>
--- a/ATIVIDADE_ESTRUTURAS_DE_DADOS.docx
+++ b/ATIVIDADE_ESTRUTURAS_DE_DADOS.docx
@@ -2791,6 +2791,2540 @@
       </w:r>
     </w:p>
     <w:p/>
+    <w:p>
+      <w:pPr>
+        <w:widowControl w:val="0"/>
+        <w:autoSpaceDE w:val="0"/>
+        <w:autoSpaceDN w:val="0"/>
+        <w:adjustRightInd w:val="0"/>
+        <w:spacing w:after="200" w:line="276" w:lineRule="auto"/>
+        <w:rPr>
+          <w:rFonts w:ascii="Calibri" w:hAnsi="Calibri" w:cs="Calibri"/>
+          <w:b/>
+          <w:bCs/>
+          <w:kern w:val="0"/>
+          <w:sz w:val="22"/>
+          <w:szCs w:val="22"/>
+          <w:lang w:val="pt"/>
+        </w:rPr>
+      </w:pPr>
+      <w:r>
+        <w:rPr>
+          <w:rFonts w:ascii="Calibri" w:hAnsi="Calibri" w:cs="Calibri"/>
+          <w:b/>
+          <w:bCs/>
+          <w:kern w:val="0"/>
+          <w:sz w:val="36"/>
+          <w:szCs w:val="36"/>
+          <w:lang w:val="pt"/>
+        </w:rPr>
+        <w:t>Parte 3 - Investigação de Busca em Matrizes</w:t>
+      </w:r>
+    </w:p>
+    <w:p>
+      <w:pPr>
+        <w:widowControl w:val="0"/>
+        <w:autoSpaceDE w:val="0"/>
+        <w:autoSpaceDN w:val="0"/>
+        <w:adjustRightInd w:val="0"/>
+        <w:spacing w:after="200" w:line="276" w:lineRule="auto"/>
+        <w:rPr>
+          <w:rFonts w:ascii="Calibri" w:hAnsi="Calibri" w:cs="Calibri"/>
+          <w:b/>
+          <w:bCs/>
+          <w:kern w:val="0"/>
+          <w:sz w:val="22"/>
+          <w:szCs w:val="22"/>
+          <w:lang w:val="pt"/>
+        </w:rPr>
+      </w:pPr>
+    </w:p>
+    <w:p>
+      <w:pPr>
+        <w:widowControl w:val="0"/>
+        <w:autoSpaceDE w:val="0"/>
+        <w:autoSpaceDN w:val="0"/>
+        <w:adjustRightInd w:val="0"/>
+        <w:spacing w:after="200" w:line="276" w:lineRule="auto"/>
+        <w:rPr>
+          <w:rFonts w:ascii="Calibri" w:hAnsi="Calibri" w:cs="Calibri"/>
+          <w:kern w:val="0"/>
+          <w:sz w:val="22"/>
+          <w:szCs w:val="22"/>
+          <w:lang w:val="pt"/>
+        </w:rPr>
+      </w:pPr>
+      <w:r>
+        <w:rPr>
+          <w:rFonts w:ascii="Calibri" w:hAnsi="Calibri" w:cs="Calibri"/>
+          <w:kern w:val="0"/>
+          <w:sz w:val="22"/>
+          <w:szCs w:val="22"/>
+          <w:lang w:val="pt"/>
+        </w:rPr>
+        <w:t>a) Por que encontrar um elemento no início exige menos operações?</w:t>
+      </w:r>
+    </w:p>
+    <w:p>
+      <w:pPr>
+        <w:widowControl w:val="0"/>
+        <w:autoSpaceDE w:val="0"/>
+        <w:autoSpaceDN w:val="0"/>
+        <w:adjustRightInd w:val="0"/>
+        <w:spacing w:after="200" w:line="276" w:lineRule="auto"/>
+        <w:rPr>
+          <w:rFonts w:ascii="Calibri" w:hAnsi="Calibri" w:cs="Calibri"/>
+          <w:kern w:val="0"/>
+          <w:sz w:val="22"/>
+          <w:szCs w:val="22"/>
+          <w:lang w:val="pt"/>
+        </w:rPr>
+      </w:pPr>
+      <w:r>
+        <w:rPr>
+          <w:rFonts w:ascii="Calibri" w:hAnsi="Calibri" w:cs="Calibri"/>
+          <w:kern w:val="0"/>
+          <w:sz w:val="22"/>
+          <w:szCs w:val="22"/>
+          <w:lang w:val="pt"/>
+        </w:rPr>
+        <w:t>Ah, porque como a busca vai olhando um por um desde o começo, se a gente der a sorte de achar o número logo na primeira posição, o programa já bate o olho, satisfaz a condição e para por ali mesmo. Aí gasta o mínimo de esforço.</w:t>
+      </w:r>
+    </w:p>
+    <w:p>
+      <w:pPr>
+        <w:widowControl w:val="0"/>
+        <w:autoSpaceDE w:val="0"/>
+        <w:autoSpaceDN w:val="0"/>
+        <w:adjustRightInd w:val="0"/>
+        <w:spacing w:after="200" w:line="276" w:lineRule="auto"/>
+        <w:rPr>
+          <w:rFonts w:ascii="Calibri" w:hAnsi="Calibri" w:cs="Calibri"/>
+          <w:kern w:val="0"/>
+          <w:sz w:val="22"/>
+          <w:szCs w:val="22"/>
+          <w:lang w:val="pt"/>
+        </w:rPr>
+      </w:pPr>
+      <w:r>
+        <w:rPr>
+          <w:rFonts w:ascii="Calibri" w:hAnsi="Calibri" w:cs="Calibri"/>
+          <w:kern w:val="0"/>
+          <w:sz w:val="22"/>
+          <w:szCs w:val="22"/>
+          <w:lang w:val="pt"/>
+        </w:rPr>
+        <w:t>b) O que acontece quando o elemento procurado não existe?</w:t>
+      </w:r>
+    </w:p>
+    <w:p>
+      <w:pPr>
+        <w:widowControl w:val="0"/>
+        <w:autoSpaceDE w:val="0"/>
+        <w:autoSpaceDN w:val="0"/>
+        <w:adjustRightInd w:val="0"/>
+        <w:spacing w:after="200" w:line="276" w:lineRule="auto"/>
+        <w:rPr>
+          <w:rFonts w:ascii="Calibri" w:hAnsi="Calibri" w:cs="Calibri"/>
+          <w:kern w:val="0"/>
+          <w:sz w:val="22"/>
+          <w:szCs w:val="22"/>
+          <w:lang w:val="pt"/>
+        </w:rPr>
+      </w:pPr>
+      <w:r>
+        <w:rPr>
+          <w:rFonts w:ascii="Calibri" w:hAnsi="Calibri" w:cs="Calibri"/>
+          <w:kern w:val="0"/>
+          <w:sz w:val="22"/>
+          <w:szCs w:val="22"/>
+          <w:lang w:val="pt"/>
+        </w:rPr>
+        <w:t>Nesse caso a gente tá frito (risos), porque o algoritmo é obrigado a varrer a matriz inteirinha, de ponta a ponta, olhando 100% das posições só para ter certeza absoluta de que o valor realmente não tava lá.</w:t>
+      </w:r>
+    </w:p>
+    <w:p>
+      <w:pPr>
+        <w:widowControl w:val="0"/>
+        <w:autoSpaceDE w:val="0"/>
+        <w:autoSpaceDN w:val="0"/>
+        <w:adjustRightInd w:val="0"/>
+        <w:spacing w:after="200" w:line="276" w:lineRule="auto"/>
+        <w:rPr>
+          <w:rFonts w:ascii="Calibri" w:hAnsi="Calibri" w:cs="Calibri"/>
+          <w:kern w:val="0"/>
+          <w:sz w:val="22"/>
+          <w:szCs w:val="22"/>
+          <w:lang w:val="pt"/>
+        </w:rPr>
+      </w:pPr>
+      <w:r>
+        <w:rPr>
+          <w:rFonts w:ascii="Calibri" w:hAnsi="Calibri" w:cs="Calibri"/>
+          <w:kern w:val="0"/>
+          <w:sz w:val="22"/>
+          <w:szCs w:val="22"/>
+          <w:lang w:val="pt"/>
+        </w:rPr>
+        <w:t>c) Qual é o pior caso da busca sequencial?</w:t>
+      </w:r>
+    </w:p>
+    <w:p>
+      <w:pPr>
+        <w:widowControl w:val="0"/>
+        <w:autoSpaceDE w:val="0"/>
+        <w:autoSpaceDN w:val="0"/>
+        <w:adjustRightInd w:val="0"/>
+        <w:spacing w:after="200" w:line="276" w:lineRule="auto"/>
+        <w:rPr>
+          <w:rFonts w:ascii="Calibri" w:hAnsi="Calibri" w:cs="Calibri"/>
+          <w:kern w:val="0"/>
+          <w:sz w:val="22"/>
+          <w:szCs w:val="22"/>
+          <w:lang w:val="pt"/>
+        </w:rPr>
+      </w:pPr>
+      <w:r>
+        <w:rPr>
+          <w:rFonts w:ascii="Calibri" w:hAnsi="Calibri" w:cs="Calibri"/>
+          <w:kern w:val="0"/>
+          <w:sz w:val="22"/>
+          <w:szCs w:val="22"/>
+          <w:lang w:val="pt"/>
+        </w:rPr>
+        <w:t>É justamente quando o número não existe ou quando ele fica escondido bem na última coluna da última linha. Aí o bicho pega e o programa tem que fazer todas as comparações possíveis.</w:t>
+      </w:r>
+    </w:p>
+    <w:p>
+      <w:pPr>
+        <w:widowControl w:val="0"/>
+        <w:autoSpaceDE w:val="0"/>
+        <w:autoSpaceDN w:val="0"/>
+        <w:adjustRightInd w:val="0"/>
+        <w:spacing w:after="200" w:line="276" w:lineRule="auto"/>
+        <w:rPr>
+          <w:rFonts w:ascii="Calibri" w:hAnsi="Calibri" w:cs="Calibri"/>
+          <w:kern w:val="0"/>
+          <w:sz w:val="22"/>
+          <w:szCs w:val="22"/>
+          <w:lang w:val="pt"/>
+        </w:rPr>
+      </w:pPr>
+      <w:r>
+        <w:rPr>
+          <w:rFonts w:ascii="Calibri" w:hAnsi="Calibri" w:cs="Calibri"/>
+          <w:kern w:val="0"/>
+          <w:sz w:val="22"/>
+          <w:szCs w:val="22"/>
+          <w:lang w:val="pt"/>
+        </w:rPr>
+        <w:t>d) Como o aumento das dimensões da matriz influencia a quantidade de operações?</w:t>
+      </w:r>
+    </w:p>
+    <w:p>
+      <w:pPr>
+        <w:widowControl w:val="0"/>
+        <w:autoSpaceDE w:val="0"/>
+        <w:autoSpaceDN w:val="0"/>
+        <w:adjustRightInd w:val="0"/>
+        <w:spacing w:after="200" w:line="276" w:lineRule="auto"/>
+        <w:rPr>
+          <w:rFonts w:ascii="Calibri" w:hAnsi="Calibri" w:cs="Calibri"/>
+          <w:kern w:val="0"/>
+          <w:sz w:val="22"/>
+          <w:szCs w:val="22"/>
+          <w:lang w:val="pt"/>
+        </w:rPr>
+      </w:pPr>
+      <w:r>
+        <w:rPr>
+          <w:rFonts w:ascii="Calibri" w:hAnsi="Calibri" w:cs="Calibri"/>
+          <w:kern w:val="0"/>
+          <w:sz w:val="22"/>
+          <w:szCs w:val="22"/>
+          <w:lang w:val="pt"/>
+        </w:rPr>
+        <w:t>Muda tudo, porque quanto maior a matriz, mais elementos ela guarda. Se a gente pula de uma matriz de 10 x 10 (que dá 100 itens) para uma de 100 x 100 (que vai para 10.000), o número de comparações no pior caso dispara na mesma proporção.</w:t>
+      </w:r>
+    </w:p>
+    <w:p>
+      <w:pPr>
+        <w:widowControl w:val="0"/>
+        <w:autoSpaceDE w:val="0"/>
+        <w:autoSpaceDN w:val="0"/>
+        <w:adjustRightInd w:val="0"/>
+        <w:spacing w:after="200" w:line="276" w:lineRule="auto"/>
+        <w:rPr>
+          <w:rFonts w:ascii="Calibri" w:hAnsi="Calibri" w:cs="Calibri"/>
+          <w:kern w:val="0"/>
+          <w:sz w:val="22"/>
+          <w:szCs w:val="22"/>
+          <w:lang w:val="pt"/>
+        </w:rPr>
+      </w:pPr>
+      <w:r>
+        <w:rPr>
+          <w:rFonts w:ascii="Calibri" w:hAnsi="Calibri" w:cs="Calibri"/>
+          <w:kern w:val="0"/>
+          <w:sz w:val="22"/>
+          <w:szCs w:val="22"/>
+          <w:lang w:val="pt"/>
+        </w:rPr>
+        <w:t>e) Qual a complexidade da busca sequencial em uma matriz com m linhas e n colunas?</w:t>
+      </w:r>
+    </w:p>
+    <w:p>
+      <w:pPr>
+        <w:widowControl w:val="0"/>
+        <w:autoSpaceDE w:val="0"/>
+        <w:autoSpaceDN w:val="0"/>
+        <w:adjustRightInd w:val="0"/>
+        <w:spacing w:after="200" w:line="276" w:lineRule="auto"/>
+        <w:rPr>
+          <w:rFonts w:ascii="Calibri" w:hAnsi="Calibri" w:cs="Calibri"/>
+          <w:kern w:val="0"/>
+          <w:sz w:val="22"/>
+          <w:szCs w:val="22"/>
+          <w:lang w:val="pt"/>
+        </w:rPr>
+      </w:pPr>
+      <w:r>
+        <w:rPr>
+          <w:rFonts w:ascii="Calibri" w:hAnsi="Calibri" w:cs="Calibri"/>
+          <w:kern w:val="0"/>
+          <w:sz w:val="22"/>
+          <w:szCs w:val="22"/>
+          <w:lang w:val="pt"/>
+        </w:rPr>
+        <w:lastRenderedPageBreak/>
+        <w:t xml:space="preserve">Pesquisando sobre isso, vi que fica </w:t>
+      </w:r>
+      <w:proofErr w:type="gramStart"/>
+      <w:r>
+        <w:rPr>
+          <w:rFonts w:ascii="Calibri" w:hAnsi="Calibri" w:cs="Calibri"/>
+          <w:kern w:val="0"/>
+          <w:sz w:val="22"/>
+          <w:szCs w:val="22"/>
+          <w:lang w:val="pt"/>
+        </w:rPr>
+        <w:t>O(</w:t>
+      </w:r>
+      <w:proofErr w:type="gramEnd"/>
+      <w:r>
+        <w:rPr>
+          <w:rFonts w:ascii="Calibri" w:hAnsi="Calibri" w:cs="Calibri"/>
+          <w:kern w:val="0"/>
+          <w:sz w:val="22"/>
+          <w:szCs w:val="22"/>
+          <w:lang w:val="pt"/>
+        </w:rPr>
+        <w:t>m x n) o pior cenário, a gente tem que passar por cada linha (m) e cada coluna (n), então o tempo de execução vai depender diretamente da multiplicação do tamanho das duas.</w:t>
+      </w:r>
+    </w:p>
+    <w:p>
+      <w:pPr>
+        <w:widowControl w:val="0"/>
+        <w:autoSpaceDE w:val="0"/>
+        <w:autoSpaceDN w:val="0"/>
+        <w:adjustRightInd w:val="0"/>
+        <w:spacing w:after="200" w:line="276" w:lineRule="auto"/>
+        <w:rPr>
+          <w:rFonts w:ascii="Calibri" w:hAnsi="Calibri" w:cs="Calibri"/>
+          <w:kern w:val="0"/>
+          <w:sz w:val="22"/>
+          <w:szCs w:val="22"/>
+          <w:lang w:val="pt"/>
+        </w:rPr>
+      </w:pPr>
+    </w:p>
+    <w:p>
+      <w:pPr>
+        <w:widowControl w:val="0"/>
+        <w:autoSpaceDE w:val="0"/>
+        <w:autoSpaceDN w:val="0"/>
+        <w:adjustRightInd w:val="0"/>
+        <w:spacing w:after="200" w:line="276" w:lineRule="auto"/>
+        <w:rPr>
+          <w:rFonts w:ascii="Calibri" w:hAnsi="Calibri" w:cs="Calibri"/>
+          <w:kern w:val="0"/>
+          <w:sz w:val="22"/>
+          <w:szCs w:val="22"/>
+          <w:lang w:val="pt"/>
+        </w:rPr>
+      </w:pPr>
+      <w:r>
+        <w:rPr>
+          <w:rFonts w:ascii="Calibri" w:hAnsi="Calibri" w:cs="Calibri"/>
+          <w:b/>
+          <w:bCs/>
+          <w:kern w:val="0"/>
+          <w:sz w:val="36"/>
+          <w:szCs w:val="36"/>
+          <w:lang w:val="pt"/>
+        </w:rPr>
+        <w:t>PARTE 4 - HANDS ON 1: INVESTIGAÇÃO DO ARRAY</w:t>
+      </w:r>
+    </w:p>
+    <w:p>
+      <w:pPr>
+        <w:widowControl w:val="0"/>
+        <w:autoSpaceDE w:val="0"/>
+        <w:autoSpaceDN w:val="0"/>
+        <w:adjustRightInd w:val="0"/>
+        <w:spacing w:after="200" w:line="276" w:lineRule="auto"/>
+        <w:rPr>
+          <w:rFonts w:ascii="Calibri" w:hAnsi="Calibri" w:cs="Calibri"/>
+          <w:kern w:val="0"/>
+          <w:sz w:val="22"/>
+          <w:szCs w:val="22"/>
+          <w:lang w:val="pt"/>
+        </w:rPr>
+      </w:pPr>
+    </w:p>
+    <w:p>
+      <w:pPr>
+        <w:widowControl w:val="0"/>
+        <w:autoSpaceDE w:val="0"/>
+        <w:autoSpaceDN w:val="0"/>
+        <w:adjustRightInd w:val="0"/>
+        <w:spacing w:after="200" w:line="276" w:lineRule="auto"/>
+        <w:rPr>
+          <w:rFonts w:ascii="Calibri" w:hAnsi="Calibri" w:cs="Calibri"/>
+          <w:kern w:val="0"/>
+          <w:sz w:val="22"/>
+          <w:szCs w:val="22"/>
+          <w:lang w:val="pt"/>
+        </w:rPr>
+      </w:pPr>
+      <w:r>
+        <w:rPr>
+          <w:rFonts w:ascii="Calibri" w:hAnsi="Calibri" w:cs="Calibri"/>
+          <w:kern w:val="0"/>
+          <w:sz w:val="22"/>
+          <w:szCs w:val="22"/>
+          <w:lang w:val="pt"/>
+        </w:rPr>
+        <w:t xml:space="preserve">Quantidade de operações de percurso do </w:t>
+      </w:r>
+      <w:proofErr w:type="spellStart"/>
+      <w:r>
+        <w:rPr>
+          <w:rFonts w:ascii="Calibri" w:hAnsi="Calibri" w:cs="Calibri"/>
+          <w:kern w:val="0"/>
+          <w:sz w:val="22"/>
+          <w:szCs w:val="22"/>
+          <w:lang w:val="pt"/>
+        </w:rPr>
+        <w:t>array</w:t>
+      </w:r>
+      <w:proofErr w:type="spellEnd"/>
+      <w:r>
+        <w:rPr>
+          <w:rFonts w:ascii="Calibri" w:hAnsi="Calibri" w:cs="Calibri"/>
+          <w:kern w:val="0"/>
+          <w:sz w:val="22"/>
+          <w:szCs w:val="22"/>
+          <w:lang w:val="pt"/>
+        </w:rPr>
+        <w:t>:</w:t>
+      </w:r>
+    </w:p>
+    <w:p>
+      <w:pPr>
+        <w:widowControl w:val="0"/>
+        <w:autoSpaceDE w:val="0"/>
+        <w:autoSpaceDN w:val="0"/>
+        <w:adjustRightInd w:val="0"/>
+        <w:spacing w:after="200" w:line="276" w:lineRule="auto"/>
+        <w:rPr>
+          <w:rFonts w:ascii="Calibri" w:hAnsi="Calibri" w:cs="Calibri"/>
+          <w:kern w:val="0"/>
+          <w:sz w:val="22"/>
+          <w:szCs w:val="22"/>
+          <w:lang w:val="pt"/>
+        </w:rPr>
+      </w:pPr>
+      <w:r>
+        <w:rPr>
+          <w:rFonts w:ascii="Calibri" w:hAnsi="Calibri" w:cs="Calibri"/>
+          <w:kern w:val="0"/>
+          <w:sz w:val="22"/>
+          <w:szCs w:val="22"/>
+          <w:lang w:val="pt"/>
+        </w:rPr>
+        <w:t xml:space="preserve">Galera, o que a gente fez foi o seguinte: o vetor de 10 posições acabou sendo percorrido umas 4 vezes em blocos separados para ficar mais fácil de </w:t>
+      </w:r>
+      <w:proofErr w:type="spellStart"/>
+      <w:r>
+        <w:rPr>
+          <w:rFonts w:ascii="Calibri" w:hAnsi="Calibri" w:cs="Calibri"/>
+          <w:kern w:val="0"/>
+          <w:sz w:val="22"/>
+          <w:szCs w:val="22"/>
+          <w:lang w:val="pt"/>
+        </w:rPr>
+        <w:t>codar</w:t>
+      </w:r>
+      <w:proofErr w:type="spellEnd"/>
+      <w:r>
+        <w:rPr>
+          <w:rFonts w:ascii="Calibri" w:hAnsi="Calibri" w:cs="Calibri"/>
+          <w:kern w:val="0"/>
+          <w:sz w:val="22"/>
+          <w:szCs w:val="22"/>
+          <w:lang w:val="pt"/>
+        </w:rPr>
+        <w:t>. A gente usou um for para preencher (10 leituras), outro para mostrar na tela (10 impressões), mais um para somar e achar o maior e o menor (mais 10 acessos) e o último para ver quem tava acima da média (outros 10). No fim das contas, deu um total de umas 40 operações de percurso.</w:t>
+      </w:r>
+    </w:p>
+    <w:p>
+      <w:pPr>
+        <w:widowControl w:val="0"/>
+        <w:autoSpaceDE w:val="0"/>
+        <w:autoSpaceDN w:val="0"/>
+        <w:adjustRightInd w:val="0"/>
+        <w:spacing w:after="200" w:line="276" w:lineRule="auto"/>
+        <w:rPr>
+          <w:rFonts w:ascii="Calibri" w:hAnsi="Calibri" w:cs="Calibri"/>
+          <w:kern w:val="0"/>
+          <w:sz w:val="22"/>
+          <w:szCs w:val="22"/>
+          <w:lang w:val="pt"/>
+        </w:rPr>
+      </w:pPr>
+    </w:p>
+    <w:p>
+      <w:pPr>
+        <w:widowControl w:val="0"/>
+        <w:autoSpaceDE w:val="0"/>
+        <w:autoSpaceDN w:val="0"/>
+        <w:adjustRightInd w:val="0"/>
+        <w:spacing w:after="200" w:line="276" w:lineRule="auto"/>
+        <w:rPr>
+          <w:rFonts w:ascii="Calibri" w:hAnsi="Calibri" w:cs="Calibri"/>
+          <w:kern w:val="0"/>
+          <w:sz w:val="22"/>
+          <w:szCs w:val="22"/>
+          <w:lang w:val="pt"/>
+        </w:rPr>
+      </w:pPr>
+      <w:r>
+        <w:rPr>
+          <w:rFonts w:ascii="Calibri" w:hAnsi="Calibri" w:cs="Calibri"/>
+          <w:kern w:val="0"/>
+          <w:sz w:val="22"/>
+          <w:szCs w:val="22"/>
+          <w:lang w:val="pt"/>
+        </w:rPr>
+        <w:t>Complexidade do algoritmo desenvolvido:</w:t>
+      </w:r>
+    </w:p>
+    <w:p>
+      <w:pPr>
+        <w:widowControl w:val="0"/>
+        <w:autoSpaceDE w:val="0"/>
+        <w:autoSpaceDN w:val="0"/>
+        <w:adjustRightInd w:val="0"/>
+        <w:spacing w:after="200" w:line="276" w:lineRule="auto"/>
+        <w:rPr>
+          <w:rFonts w:ascii="Calibri" w:hAnsi="Calibri" w:cs="Calibri"/>
+          <w:kern w:val="0"/>
+          <w:sz w:val="22"/>
+          <w:szCs w:val="22"/>
+          <w:lang w:val="pt"/>
+        </w:rPr>
+      </w:pPr>
+      <w:r>
+        <w:rPr>
+          <w:rFonts w:ascii="Calibri" w:hAnsi="Calibri" w:cs="Calibri"/>
+          <w:kern w:val="0"/>
+          <w:sz w:val="22"/>
+          <w:szCs w:val="22"/>
+          <w:lang w:val="pt"/>
+        </w:rPr>
+        <w:t>Dá O(n) que é uma beleza, linear pura. Mesmo a gente tendo colocado vários for no código, eles ficam soltos, um depois do outro, sem nenhum loop dentro de loop. Então o tempo de execução vai subir de boa, bem retinho conforme o tamanho do vetor cresce.</w:t>
+      </w:r>
+    </w:p>
+    <w:p/>
+    <w:p>
+      <w:pPr>
+        <w:rPr>
+          <w:rFonts w:ascii="Calibri" w:hAnsi="Calibri" w:cs="Calibri"/>
+          <w:b/>
+          <w:bCs/>
+          <w:kern w:val="0"/>
+          <w:sz w:val="36"/>
+          <w:szCs w:val="36"/>
+          <w:lang w:val="pt"/>
+        </w:rPr>
+      </w:pPr>
+      <w:r>
+        <w:rPr>
+          <w:rFonts w:ascii="Calibri" w:hAnsi="Calibri" w:cs="Calibri"/>
+          <w:b/>
+          <w:bCs/>
+          <w:kern w:val="0"/>
+          <w:sz w:val="36"/>
+          <w:szCs w:val="36"/>
+          <w:lang w:val="pt"/>
+        </w:rPr>
+        <w:t xml:space="preserve">PARTE </w:t>
+      </w:r>
+      <w:r>
+        <w:rPr>
+          <w:rFonts w:ascii="Calibri" w:hAnsi="Calibri" w:cs="Calibri"/>
+          <w:b/>
+          <w:bCs/>
+          <w:kern w:val="0"/>
+          <w:sz w:val="36"/>
+          <w:szCs w:val="36"/>
+          <w:lang w:val="pt"/>
+        </w:rPr>
+        <w:t>5</w:t>
+      </w:r>
+      <w:r>
+        <w:rPr>
+          <w:rFonts w:ascii="Calibri" w:hAnsi="Calibri" w:cs="Calibri"/>
+          <w:b/>
+          <w:bCs/>
+          <w:kern w:val="0"/>
+          <w:sz w:val="36"/>
+          <w:szCs w:val="36"/>
+          <w:lang w:val="pt"/>
+        </w:rPr>
+        <w:t xml:space="preserve"> </w:t>
+      </w:r>
+      <w:r>
+        <w:rPr>
+          <w:rFonts w:ascii="Calibri" w:hAnsi="Calibri" w:cs="Calibri"/>
+          <w:b/>
+          <w:bCs/>
+          <w:kern w:val="0"/>
+          <w:sz w:val="36"/>
+          <w:szCs w:val="36"/>
+          <w:lang w:val="pt"/>
+        </w:rPr>
+        <w:t>–</w:t>
+      </w:r>
+      <w:r>
+        <w:rPr>
+          <w:rFonts w:ascii="Calibri" w:hAnsi="Calibri" w:cs="Calibri"/>
+          <w:b/>
+          <w:bCs/>
+          <w:kern w:val="0"/>
+          <w:sz w:val="36"/>
+          <w:szCs w:val="36"/>
+          <w:lang w:val="pt"/>
+        </w:rPr>
+        <w:t xml:space="preserve"> </w:t>
+      </w:r>
+      <w:r>
+        <w:rPr>
+          <w:rFonts w:ascii="Calibri" w:hAnsi="Calibri" w:cs="Calibri"/>
+          <w:b/>
+          <w:bCs/>
+          <w:kern w:val="0"/>
+          <w:sz w:val="36"/>
+          <w:szCs w:val="36"/>
+          <w:lang w:val="pt"/>
+        </w:rPr>
+        <w:t>CALCÚLO DA MÉDIA GERAL</w:t>
+      </w:r>
+    </w:p>
+    <w:p>
+      <w:r>
+        <w:t>#define SENSORES 5</w:t>
+      </w:r>
+    </w:p>
+    <w:p>
+      <w:r>
+        <w:t>#define HORAS 24</w:t>
+      </w:r>
+    </w:p>
+    <w:p/>
+    <w:p>
+      <w:proofErr w:type="spellStart"/>
+      <w:r>
+        <w:t>int</w:t>
+      </w:r>
+      <w:proofErr w:type="spellEnd"/>
+      <w:r>
+        <w:t xml:space="preserve"> </w:t>
+      </w:r>
+      <w:proofErr w:type="spellStart"/>
+      <w:proofErr w:type="gramStart"/>
+      <w:r>
+        <w:t>main</w:t>
+      </w:r>
+      <w:proofErr w:type="spellEnd"/>
+      <w:r>
+        <w:t>(</w:t>
+      </w:r>
+      <w:proofErr w:type="gramEnd"/>
+      <w:r>
+        <w:t>) {</w:t>
+      </w:r>
+    </w:p>
+    <w:p>
+      <w:r>
+        <w:t xml:space="preserve">    </w:t>
+      </w:r>
+      <w:proofErr w:type="spellStart"/>
+      <w:r>
+        <w:t>float</w:t>
+      </w:r>
+      <w:proofErr w:type="spellEnd"/>
+      <w:r>
+        <w:t xml:space="preserve"> </w:t>
+      </w:r>
+      <w:proofErr w:type="gramStart"/>
+      <w:r>
+        <w:t>sensores[</w:t>
+      </w:r>
+      <w:proofErr w:type="gramEnd"/>
+      <w:r>
+        <w:t>SENSORES][HORAS];</w:t>
+      </w:r>
+    </w:p>
+    <w:p>
+      <w:r>
+        <w:t xml:space="preserve">    </w:t>
+      </w:r>
+      <w:proofErr w:type="spellStart"/>
+      <w:r>
+        <w:t>float</w:t>
+      </w:r>
+      <w:proofErr w:type="spellEnd"/>
+      <w:r>
+        <w:t xml:space="preserve"> </w:t>
+      </w:r>
+      <w:proofErr w:type="spellStart"/>
+      <w:r>
+        <w:t>soma_sensor</w:t>
+      </w:r>
+      <w:proofErr w:type="spellEnd"/>
+      <w:r>
+        <w:t xml:space="preserve">, </w:t>
+      </w:r>
+      <w:proofErr w:type="spellStart"/>
+      <w:r>
+        <w:t>maior_temp</w:t>
+      </w:r>
+      <w:proofErr w:type="spellEnd"/>
+      <w:r>
+        <w:t xml:space="preserve">, </w:t>
+      </w:r>
+      <w:proofErr w:type="spellStart"/>
+      <w:r>
+        <w:t>soma_geral</w:t>
+      </w:r>
+      <w:proofErr w:type="spellEnd"/>
+      <w:r>
+        <w:t xml:space="preserve"> = 0.0, limite;</w:t>
+      </w:r>
+    </w:p>
+    <w:p>
+      <w:r>
+        <w:t xml:space="preserve">    </w:t>
+      </w:r>
+      <w:proofErr w:type="spellStart"/>
+      <w:r>
+        <w:t>int</w:t>
+      </w:r>
+      <w:proofErr w:type="spellEnd"/>
+      <w:r>
+        <w:t xml:space="preserve"> </w:t>
+      </w:r>
+      <w:proofErr w:type="spellStart"/>
+      <w:r>
+        <w:t>sensor_maior</w:t>
+      </w:r>
+      <w:proofErr w:type="spellEnd"/>
+      <w:r>
+        <w:t xml:space="preserve"> = 0, </w:t>
+      </w:r>
+      <w:proofErr w:type="spellStart"/>
+      <w:r>
+        <w:t>hora_maior</w:t>
+      </w:r>
+      <w:proofErr w:type="spellEnd"/>
+      <w:r>
+        <w:t xml:space="preserve"> = 0, </w:t>
+      </w:r>
+      <w:proofErr w:type="spellStart"/>
+      <w:r>
+        <w:t>acima_limite</w:t>
+      </w:r>
+      <w:proofErr w:type="spellEnd"/>
+      <w:r>
+        <w:t xml:space="preserve"> = 0;</w:t>
+      </w:r>
+    </w:p>
+    <w:p/>
+    <w:p>
+      <w:r>
+        <w:t xml:space="preserve">    // Inicialização da matriz com valores simulados (15.0 a 35.0 °C)</w:t>
+      </w:r>
+    </w:p>
+    <w:p>
+      <w:r>
+        <w:t xml:space="preserve">    </w:t>
+      </w:r>
+      <w:proofErr w:type="spellStart"/>
+      <w:r>
+        <w:t>srand</w:t>
+      </w:r>
+      <w:proofErr w:type="spellEnd"/>
+      <w:r>
+        <w:t>(</w:t>
+      </w:r>
+      <w:proofErr w:type="gramStart"/>
+      <w:r>
+        <w:t>time(</w:t>
+      </w:r>
+      <w:proofErr w:type="gramEnd"/>
+      <w:r>
+        <w:t>NULL));</w:t>
+      </w:r>
+    </w:p>
+    <w:p>
+      <w:r>
+        <w:t xml:space="preserve">    for (</w:t>
+      </w:r>
+      <w:proofErr w:type="spellStart"/>
+      <w:r>
+        <w:t>int</w:t>
+      </w:r>
+      <w:proofErr w:type="spellEnd"/>
+      <w:r>
+        <w:t xml:space="preserve"> i = 0; i &lt; SENSORES; i++) {</w:t>
+      </w:r>
+    </w:p>
+    <w:p>
+      <w:r>
+        <w:lastRenderedPageBreak/>
+        <w:t xml:space="preserve">        for (</w:t>
+      </w:r>
+      <w:proofErr w:type="spellStart"/>
+      <w:r>
+        <w:t>int</w:t>
+      </w:r>
+      <w:proofErr w:type="spellEnd"/>
+      <w:r>
+        <w:t xml:space="preserve"> j = 0; j &lt; HORAS; j++) {</w:t>
+      </w:r>
+    </w:p>
+    <w:p>
+      <w:r>
+        <w:t xml:space="preserve">            sensores[i][j] = 15.0 + ((</w:t>
+      </w:r>
+      <w:proofErr w:type="spellStart"/>
+      <w:r>
+        <w:t>float</w:t>
+      </w:r>
+      <w:proofErr w:type="spellEnd"/>
+      <w:r>
+        <w:t>)</w:t>
+      </w:r>
+      <w:proofErr w:type="spellStart"/>
+      <w:proofErr w:type="gramStart"/>
+      <w:r>
+        <w:t>rand</w:t>
+      </w:r>
+      <w:proofErr w:type="spellEnd"/>
+      <w:r>
+        <w:t>(</w:t>
+      </w:r>
+      <w:proofErr w:type="gramEnd"/>
+      <w:r>
+        <w:t>) / RAND_MAX) * 20.0;</w:t>
+      </w:r>
+    </w:p>
+    <w:p>
+      <w:r>
+        <w:t xml:space="preserve">        }</w:t>
+      </w:r>
+    </w:p>
+    <w:p>
+      <w:r>
+        <w:t xml:space="preserve">    }</w:t>
+      </w:r>
+    </w:p>
+    <w:p/>
+    <w:p>
+      <w:r>
+        <w:t xml:space="preserve">    // 1. Média de cada sensor, 2. Maior temperatura, 3. Sensor responsável, 4. Horário e 5. Soma geral</w:t>
+      </w:r>
+    </w:p>
+    <w:p>
+      <w:r>
+        <w:t xml:space="preserve">    </w:t>
+      </w:r>
+      <w:proofErr w:type="spellStart"/>
+      <w:r>
+        <w:t>maior_temp</w:t>
+      </w:r>
+      <w:proofErr w:type="spellEnd"/>
+      <w:r>
+        <w:t xml:space="preserve"> = </w:t>
+      </w:r>
+      <w:proofErr w:type="gramStart"/>
+      <w:r>
+        <w:t>sensores[</w:t>
+      </w:r>
+      <w:proofErr w:type="gramEnd"/>
+      <w:r>
+        <w:t>0][0];</w:t>
+      </w:r>
+    </w:p>
+    <w:p/>
+    <w:p>
+      <w:r>
+        <w:t xml:space="preserve">    </w:t>
+      </w:r>
+      <w:proofErr w:type="spellStart"/>
+      <w:proofErr w:type="gramStart"/>
+      <w:r>
+        <w:t>printf</w:t>
+      </w:r>
+      <w:proofErr w:type="spellEnd"/>
+      <w:r>
+        <w:t>(</w:t>
+      </w:r>
+      <w:proofErr w:type="gramEnd"/>
+      <w:r>
+        <w:t>"=== 1. MEDIA DE CADA SENSOR ===\n");</w:t>
+      </w:r>
+    </w:p>
+    <w:p>
+      <w:r>
+        <w:t xml:space="preserve">    for (</w:t>
+      </w:r>
+      <w:proofErr w:type="spellStart"/>
+      <w:r>
+        <w:t>int</w:t>
+      </w:r>
+      <w:proofErr w:type="spellEnd"/>
+      <w:r>
+        <w:t xml:space="preserve"> i = 0; i &lt; SENSORES; i++) {</w:t>
+      </w:r>
+    </w:p>
+    <w:p>
+      <w:r>
+        <w:t xml:space="preserve">        </w:t>
+      </w:r>
+      <w:proofErr w:type="spellStart"/>
+      <w:r>
+        <w:t>soma_sensor</w:t>
+      </w:r>
+      <w:proofErr w:type="spellEnd"/>
+      <w:r>
+        <w:t xml:space="preserve"> = 0.0;</w:t>
+      </w:r>
+    </w:p>
+    <w:p>
+      <w:r>
+        <w:t xml:space="preserve">        for (</w:t>
+      </w:r>
+      <w:proofErr w:type="spellStart"/>
+      <w:r>
+        <w:t>int</w:t>
+      </w:r>
+      <w:proofErr w:type="spellEnd"/>
+      <w:r>
+        <w:t xml:space="preserve"> j = 0; j &lt; HORAS; j++) {</w:t>
+      </w:r>
+    </w:p>
+    <w:p>
+      <w:r>
+        <w:t xml:space="preserve">            </w:t>
+      </w:r>
+      <w:proofErr w:type="spellStart"/>
+      <w:r>
+        <w:t>float</w:t>
+      </w:r>
+      <w:proofErr w:type="spellEnd"/>
+      <w:r>
+        <w:t xml:space="preserve"> </w:t>
+      </w:r>
+      <w:proofErr w:type="spellStart"/>
+      <w:r>
+        <w:t>temp_atual</w:t>
+      </w:r>
+      <w:proofErr w:type="spellEnd"/>
+      <w:r>
+        <w:t xml:space="preserve"> = sensores[i][j];</w:t>
+      </w:r>
+    </w:p>
+    <w:p>
+      <w:r>
+        <w:t xml:space="preserve">            </w:t>
+      </w:r>
+      <w:proofErr w:type="spellStart"/>
+      <w:r>
+        <w:t>soma_sensor</w:t>
+      </w:r>
+      <w:proofErr w:type="spellEnd"/>
+      <w:r>
+        <w:t xml:space="preserve"> += </w:t>
+      </w:r>
+      <w:proofErr w:type="spellStart"/>
+      <w:r>
+        <w:t>temp_atual</w:t>
+      </w:r>
+      <w:proofErr w:type="spellEnd"/>
+      <w:r>
+        <w:t>;</w:t>
+      </w:r>
+    </w:p>
+    <w:p>
+      <w:r>
+        <w:t xml:space="preserve">            </w:t>
+      </w:r>
+      <w:proofErr w:type="spellStart"/>
+      <w:r>
+        <w:t>soma_geral</w:t>
+      </w:r>
+      <w:proofErr w:type="spellEnd"/>
+      <w:r>
+        <w:t xml:space="preserve"> += </w:t>
+      </w:r>
+      <w:proofErr w:type="spellStart"/>
+      <w:r>
+        <w:t>temp_atual</w:t>
+      </w:r>
+      <w:proofErr w:type="spellEnd"/>
+      <w:r>
+        <w:t>;</w:t>
+      </w:r>
+    </w:p>
+    <w:p/>
+    <w:p>
+      <w:r>
+        <w:t xml:space="preserve">            // Atualiza o maior valor e seus índices</w:t>
+      </w:r>
+    </w:p>
+    <w:p>
+      <w:r>
+        <w:t xml:space="preserve">            </w:t>
+      </w:r>
+      <w:proofErr w:type="spellStart"/>
+      <w:r>
+        <w:t>if</w:t>
+      </w:r>
+      <w:proofErr w:type="spellEnd"/>
+      <w:r>
+        <w:t xml:space="preserve"> (</w:t>
+      </w:r>
+      <w:proofErr w:type="spellStart"/>
+      <w:r>
+        <w:t>temp_atual</w:t>
+      </w:r>
+      <w:proofErr w:type="spellEnd"/>
+      <w:r>
+        <w:t xml:space="preserve"> &gt; </w:t>
+      </w:r>
+      <w:proofErr w:type="spellStart"/>
+      <w:r>
+        <w:t>maior_temp</w:t>
+      </w:r>
+      <w:proofErr w:type="spellEnd"/>
+      <w:r>
+        <w:t>) {</w:t>
+      </w:r>
+    </w:p>
+    <w:p>
+      <w:r>
+        <w:t xml:space="preserve">                </w:t>
+      </w:r>
+      <w:proofErr w:type="spellStart"/>
+      <w:r>
+        <w:t>maior_temp</w:t>
+      </w:r>
+      <w:proofErr w:type="spellEnd"/>
+      <w:r>
+        <w:t xml:space="preserve"> = </w:t>
+      </w:r>
+      <w:proofErr w:type="spellStart"/>
+      <w:r>
+        <w:t>temp_atual</w:t>
+      </w:r>
+      <w:proofErr w:type="spellEnd"/>
+      <w:r>
+        <w:t>;</w:t>
+      </w:r>
+    </w:p>
+    <w:p>
+      <w:r>
+        <w:t xml:space="preserve">                </w:t>
+      </w:r>
+      <w:proofErr w:type="spellStart"/>
+      <w:r>
+        <w:t>sensor_maior</w:t>
+      </w:r>
+      <w:proofErr w:type="spellEnd"/>
+      <w:r>
+        <w:t xml:space="preserve"> = i;</w:t>
+      </w:r>
+    </w:p>
+    <w:p>
+      <w:r>
+        <w:t xml:space="preserve">                </w:t>
+      </w:r>
+      <w:proofErr w:type="spellStart"/>
+      <w:r>
+        <w:t>hora_maior</w:t>
+      </w:r>
+      <w:proofErr w:type="spellEnd"/>
+      <w:r>
+        <w:t xml:space="preserve"> = j;</w:t>
+      </w:r>
+    </w:p>
+    <w:p>
+      <w:r>
+        <w:t xml:space="preserve">            }</w:t>
+      </w:r>
+    </w:p>
+    <w:p>
+      <w:r>
+        <w:t xml:space="preserve">        }</w:t>
+      </w:r>
+    </w:p>
+    <w:p>
+      <w:r>
+        <w:t xml:space="preserve">        </w:t>
+      </w:r>
+      <w:proofErr w:type="spellStart"/>
+      <w:proofErr w:type="gramStart"/>
+      <w:r>
+        <w:t>printf</w:t>
+      </w:r>
+      <w:proofErr w:type="spellEnd"/>
+      <w:r>
+        <w:t>(</w:t>
+      </w:r>
+      <w:proofErr w:type="gramEnd"/>
+      <w:r>
+        <w:t xml:space="preserve">"Sensor %d: %.2f °C\n", i + 1, </w:t>
+      </w:r>
+      <w:proofErr w:type="spellStart"/>
+      <w:r>
+        <w:t>soma_sensor</w:t>
+      </w:r>
+      <w:proofErr w:type="spellEnd"/>
+      <w:r>
+        <w:t xml:space="preserve"> / HORAS);</w:t>
+      </w:r>
+    </w:p>
+    <w:p>
+      <w:r>
+        <w:t xml:space="preserve">    }</w:t>
+      </w:r>
+    </w:p>
+    <w:p/>
+    <w:p>
+      <w:r>
+        <w:t xml:space="preserve">    // Exibição dos dados consolidados (itens 2, 3, 4 e 5)</w:t>
+      </w:r>
+    </w:p>
+    <w:p>
+      <w:r>
+        <w:lastRenderedPageBreak/>
+        <w:t xml:space="preserve">    </w:t>
+      </w:r>
+      <w:proofErr w:type="spellStart"/>
+      <w:proofErr w:type="gramStart"/>
+      <w:r>
+        <w:t>printf</w:t>
+      </w:r>
+      <w:proofErr w:type="spellEnd"/>
+      <w:r>
+        <w:t>(</w:t>
+      </w:r>
+      <w:proofErr w:type="gramEnd"/>
+      <w:r>
+        <w:t>"\n=== DETALHES GERAIS ===\n");</w:t>
+      </w:r>
+    </w:p>
+    <w:p>
+      <w:r>
+        <w:t xml:space="preserve">    </w:t>
+      </w:r>
+      <w:proofErr w:type="spellStart"/>
+      <w:proofErr w:type="gramStart"/>
+      <w:r>
+        <w:t>printf</w:t>
+      </w:r>
+      <w:proofErr w:type="spellEnd"/>
+      <w:r>
+        <w:t>(</w:t>
+      </w:r>
+      <w:proofErr w:type="gramEnd"/>
+      <w:r>
+        <w:t xml:space="preserve">"2. Maior temperatura registrada: %.2f °C\n", </w:t>
+      </w:r>
+      <w:proofErr w:type="spellStart"/>
+      <w:r>
+        <w:t>maior_temp</w:t>
+      </w:r>
+      <w:proofErr w:type="spellEnd"/>
+      <w:r>
+        <w:t>);</w:t>
+      </w:r>
+    </w:p>
+    <w:p>
+      <w:r>
+        <w:t xml:space="preserve">    </w:t>
+      </w:r>
+      <w:proofErr w:type="spellStart"/>
+      <w:proofErr w:type="gramStart"/>
+      <w:r>
+        <w:t>printf</w:t>
+      </w:r>
+      <w:proofErr w:type="spellEnd"/>
+      <w:r>
+        <w:t>(</w:t>
+      </w:r>
+      <w:proofErr w:type="gramEnd"/>
+      <w:r>
+        <w:t xml:space="preserve">"3. Sensor responsável: Sensor %d\n", </w:t>
+      </w:r>
+      <w:proofErr w:type="spellStart"/>
+      <w:r>
+        <w:t>sensor_maior</w:t>
+      </w:r>
+      <w:proofErr w:type="spellEnd"/>
+      <w:r>
+        <w:t xml:space="preserve"> + 1);</w:t>
+      </w:r>
+    </w:p>
+    <w:p>
+      <w:r>
+        <w:t xml:space="preserve">    </w:t>
+      </w:r>
+      <w:proofErr w:type="spellStart"/>
+      <w:proofErr w:type="gramStart"/>
+      <w:r>
+        <w:t>printf</w:t>
+      </w:r>
+      <w:proofErr w:type="spellEnd"/>
+      <w:r>
+        <w:t>(</w:t>
+      </w:r>
+      <w:proofErr w:type="gramEnd"/>
+      <w:r>
+        <w:t xml:space="preserve">"4. Horário da ocorrência: %d:00h\n", </w:t>
+      </w:r>
+      <w:proofErr w:type="spellStart"/>
+      <w:r>
+        <w:t>hora_maior</w:t>
+      </w:r>
+      <w:proofErr w:type="spellEnd"/>
+      <w:r>
+        <w:t>);</w:t>
+      </w:r>
+    </w:p>
+    <w:p>
+      <w:r>
+        <w:t xml:space="preserve">    </w:t>
+      </w:r>
+      <w:proofErr w:type="spellStart"/>
+      <w:proofErr w:type="gramStart"/>
+      <w:r>
+        <w:t>printf</w:t>
+      </w:r>
+      <w:proofErr w:type="spellEnd"/>
+      <w:r>
+        <w:t>(</w:t>
+      </w:r>
+      <w:proofErr w:type="gramEnd"/>
+      <w:r>
+        <w:t xml:space="preserve">"5. Média geral (120 medições): %.2f °C\n", </w:t>
+      </w:r>
+      <w:proofErr w:type="spellStart"/>
+      <w:r>
+        <w:t>soma_geral</w:t>
+      </w:r>
+      <w:proofErr w:type="spellEnd"/>
+      <w:r>
+        <w:t xml:space="preserve"> / (SENSORES * HORAS));</w:t>
+      </w:r>
+    </w:p>
+    <w:p/>
+    <w:p>
+      <w:r>
+        <w:t xml:space="preserve">    // 6. Leituras acima de um limite informado pelo usuário</w:t>
+      </w:r>
+    </w:p>
+    <w:p>
+      <w:r>
+        <w:t xml:space="preserve">    </w:t>
+      </w:r>
+      <w:proofErr w:type="spellStart"/>
+      <w:proofErr w:type="gramStart"/>
+      <w:r>
+        <w:t>printf</w:t>
+      </w:r>
+      <w:proofErr w:type="spellEnd"/>
+      <w:r>
+        <w:t>(</w:t>
+      </w:r>
+      <w:proofErr w:type="gramEnd"/>
+      <w:r>
+        <w:t>"\n=== 6. VERIFICAÇÃO DE LIMITE ===\n");</w:t>
+      </w:r>
+    </w:p>
+    <w:p>
+      <w:r>
+        <w:t xml:space="preserve">    </w:t>
+      </w:r>
+      <w:proofErr w:type="spellStart"/>
+      <w:proofErr w:type="gramStart"/>
+      <w:r>
+        <w:t>printf</w:t>
+      </w:r>
+      <w:proofErr w:type="spellEnd"/>
+      <w:r>
+        <w:t>(</w:t>
+      </w:r>
+      <w:proofErr w:type="gramEnd"/>
+      <w:r>
+        <w:t>"Digite a temperatura limite para verificação (°C): ");</w:t>
+      </w:r>
+    </w:p>
+    <w:p>
+      <w:r>
+        <w:t xml:space="preserve">    </w:t>
+      </w:r>
+      <w:proofErr w:type="spellStart"/>
+      <w:proofErr w:type="gramStart"/>
+      <w:r>
+        <w:t>scanf</w:t>
+      </w:r>
+      <w:proofErr w:type="spellEnd"/>
+      <w:r>
+        <w:t>(</w:t>
+      </w:r>
+      <w:proofErr w:type="gramEnd"/>
+      <w:r>
+        <w:t>"%f", &amp;limite);</w:t>
+      </w:r>
+    </w:p>
+    <w:p/>
+    <w:p>
+      <w:r>
+        <w:t xml:space="preserve">    for (</w:t>
+      </w:r>
+      <w:proofErr w:type="spellStart"/>
+      <w:r>
+        <w:t>int</w:t>
+      </w:r>
+      <w:proofErr w:type="spellEnd"/>
+      <w:r>
+        <w:t xml:space="preserve"> i = 0; i &lt; SENSORES; i++) {</w:t>
+      </w:r>
+    </w:p>
+    <w:p>
+      <w:r>
+        <w:t xml:space="preserve">        for (</w:t>
+      </w:r>
+      <w:proofErr w:type="spellStart"/>
+      <w:r>
+        <w:t>int</w:t>
+      </w:r>
+      <w:proofErr w:type="spellEnd"/>
+      <w:r>
+        <w:t xml:space="preserve"> j = 0; j &lt; HORAS; j++) {</w:t>
+      </w:r>
+    </w:p>
+    <w:p>
+      <w:r>
+        <w:t xml:space="preserve">            </w:t>
+      </w:r>
+      <w:proofErr w:type="spellStart"/>
+      <w:r>
+        <w:t>if</w:t>
+      </w:r>
+      <w:proofErr w:type="spellEnd"/>
+      <w:r>
+        <w:t xml:space="preserve"> (sensores[i][j] &gt; limite) {</w:t>
+      </w:r>
+    </w:p>
+    <w:p>
+      <w:r>
+        <w:t xml:space="preserve">                </w:t>
+      </w:r>
+      <w:proofErr w:type="spellStart"/>
+      <w:r>
+        <w:t>acima_limite</w:t>
+      </w:r>
+      <w:proofErr w:type="spellEnd"/>
+      <w:r>
+        <w:t>++;</w:t>
+      </w:r>
+    </w:p>
+    <w:p>
+      <w:r>
+        <w:t xml:space="preserve">            }</w:t>
+      </w:r>
+    </w:p>
+    <w:p>
+      <w:r>
+        <w:t xml:space="preserve">        }</w:t>
+      </w:r>
+    </w:p>
+    <w:p>
+      <w:r>
+        <w:t xml:space="preserve">    }</w:t>
+      </w:r>
+    </w:p>
+    <w:p/>
+    <w:p>
+      <w:r>
+        <w:t xml:space="preserve">    </w:t>
+      </w:r>
+      <w:proofErr w:type="spellStart"/>
+      <w:proofErr w:type="gramStart"/>
+      <w:r>
+        <w:t>printf</w:t>
+      </w:r>
+      <w:proofErr w:type="spellEnd"/>
+      <w:r>
+        <w:t>(</w:t>
+      </w:r>
+      <w:proofErr w:type="gramEnd"/>
+      <w:r>
+        <w:t>"Limite informado: %.2f °C\n", limite);</w:t>
+      </w:r>
+    </w:p>
+    <w:p>
+      <w:r>
+        <w:t xml:space="preserve">    </w:t>
+      </w:r>
+      <w:proofErr w:type="spellStart"/>
+      <w:proofErr w:type="gramStart"/>
+      <w:r>
+        <w:t>printf</w:t>
+      </w:r>
+      <w:proofErr w:type="spellEnd"/>
+      <w:r>
+        <w:t>(</w:t>
+      </w:r>
+      <w:proofErr w:type="gramEnd"/>
+      <w:r>
+        <w:t xml:space="preserve">"Quantidade de leituras acima do limite: %d\n", </w:t>
+      </w:r>
+      <w:proofErr w:type="spellStart"/>
+      <w:r>
+        <w:t>acima_limite</w:t>
+      </w:r>
+      <w:proofErr w:type="spellEnd"/>
+      <w:r>
+        <w:t>);</w:t>
+      </w:r>
+    </w:p>
+    <w:p/>
+    <w:p>
+      <w:r>
+        <w:t xml:space="preserve">    </w:t>
+      </w:r>
+      <w:proofErr w:type="spellStart"/>
+      <w:r>
+        <w:t>return</w:t>
+      </w:r>
+      <w:proofErr w:type="spellEnd"/>
+      <w:r>
+        <w:t xml:space="preserve"> 0;</w:t>
+      </w:r>
+    </w:p>
+    <w:p>
+      <w:r>
+        <w:t>}</w:t>
+      </w:r>
+    </w:p>
+    <w:p/>
+    <w:p>
+      <w:r>
+        <w:t xml:space="preserve">Resumidamente, o código cria uma </w:t>
+      </w:r>
+      <w:r>
+        <w:rPr>
+          <w:b/>
+          <w:bCs/>
+        </w:rPr>
+        <w:t>matriz de 5 sensores por 24 horas</w:t>
+      </w:r>
+      <w:r>
+        <w:t xml:space="preserve">, totalizando </w:t>
+      </w:r>
+      <w:r>
+        <w:rPr>
+          <w:b/>
+          <w:bCs/>
+        </w:rPr>
+        <w:t>120 medições de temperatura</w:t>
+      </w:r>
+      <w:r>
+        <w:t>.</w:t>
+      </w:r>
+    </w:p>
+    <w:p>
+      <w:pPr>
+        <w:rPr>
+          <w:b/>
+          <w:bCs/>
+        </w:rPr>
+      </w:pPr>
+      <w:r>
+        <w:rPr>
+          <w:b/>
+          <w:bCs/>
+        </w:rPr>
+        <w:t>O que ele faz:</w:t>
+      </w:r>
+    </w:p>
+    <w:p>
+      <w:pPr>
+        <w:numPr>
+          <w:ilvl w:val="0"/>
+          <w:numId w:val="6"/>
+        </w:numPr>
+      </w:pPr>
+      <w:r>
+        <w:rPr>
+          <w:b/>
+          <w:bCs/>
+        </w:rPr>
+        <w:lastRenderedPageBreak/>
+        <w:t>Preenche a matriz</w:t>
+      </w:r>
+      <w:r>
+        <w:t xml:space="preserve"> com temperaturas aleatórias entre </w:t>
+      </w:r>
+      <w:r>
+        <w:rPr>
+          <w:b/>
+          <w:bCs/>
+        </w:rPr>
+        <w:t>15°C e 35°C</w:t>
+      </w:r>
+      <w:r>
+        <w:t xml:space="preserve">. </w:t>
+      </w:r>
+    </w:p>
+    <w:p>
+      <w:pPr>
+        <w:numPr>
+          <w:ilvl w:val="0"/>
+          <w:numId w:val="6"/>
+        </w:numPr>
+      </w:pPr>
+      <w:r>
+        <w:rPr>
+          <w:b/>
+          <w:bCs/>
+        </w:rPr>
+        <w:t>Calcula a média de cada sensor</w:t>
+      </w:r>
+      <w:r>
+        <w:t xml:space="preserve">, usando suas 24 medições. </w:t>
+      </w:r>
+    </w:p>
+    <w:p>
+      <w:pPr>
+        <w:numPr>
+          <w:ilvl w:val="0"/>
+          <w:numId w:val="6"/>
+        </w:numPr>
+      </w:pPr>
+      <w:r>
+        <w:rPr>
+          <w:b/>
+          <w:bCs/>
+        </w:rPr>
+        <w:t>Encontra a maior temperatura</w:t>
+      </w:r>
+      <w:r>
+        <w:t xml:space="preserve"> registrada. </w:t>
+      </w:r>
+    </w:p>
+    <w:p>
+      <w:pPr>
+        <w:numPr>
+          <w:ilvl w:val="0"/>
+          <w:numId w:val="6"/>
+        </w:numPr>
+      </w:pPr>
+      <w:r>
+        <w:rPr>
+          <w:b/>
+          <w:bCs/>
+        </w:rPr>
+        <w:t>Identifica qual sensor e qual horário</w:t>
+      </w:r>
+      <w:r>
+        <w:t xml:space="preserve"> registraram essa maior temperatura. </w:t>
+      </w:r>
+    </w:p>
+    <w:p>
+      <w:pPr>
+        <w:numPr>
+          <w:ilvl w:val="0"/>
+          <w:numId w:val="6"/>
+        </w:numPr>
+      </w:pPr>
+      <w:r>
+        <w:rPr>
+          <w:b/>
+          <w:bCs/>
+        </w:rPr>
+        <w:t>Calcula a média geral das 120 medições</w:t>
+      </w:r>
+      <w:r>
+        <w:t>, somando todas as temperaturas e dividindo por:</w:t>
+      </w:r>
+      <w:r>
+        <w:br/>
+      </w:r>
+      <w:r>
+        <w:rPr>
+          <w:b/>
+          <w:bCs/>
+        </w:rPr>
+        <w:t>5 × 24 = 120</w:t>
+      </w:r>
+      <w:r>
+        <w:t xml:space="preserve">. </w:t>
+      </w:r>
+    </w:p>
+    <w:p>
+      <w:pPr>
+        <w:numPr>
+          <w:ilvl w:val="0"/>
+          <w:numId w:val="6"/>
+        </w:numPr>
+      </w:pPr>
+      <w:r>
+        <w:t xml:space="preserve">Pede uma </w:t>
+      </w:r>
+      <w:r>
+        <w:rPr>
+          <w:b/>
+          <w:bCs/>
+        </w:rPr>
+        <w:t>temperatura limite</w:t>
+      </w:r>
+      <w:r>
+        <w:t xml:space="preserve"> ao usuário e conta quantas medições ficaram acima dela.</w:t>
+      </w:r>
+    </w:p>
+    <w:p/>
+    <w:p/>
+    <w:p>
+      <w:pPr>
+        <w:rPr>
+          <w:rFonts w:ascii="Calibri" w:hAnsi="Calibri" w:cs="Calibri"/>
+          <w:b/>
+          <w:sz w:val="36"/>
+          <w:szCs w:val="36"/>
+        </w:rPr>
+      </w:pPr>
+      <w:r>
+        <w:rPr>
+          <w:rFonts w:ascii="Calibri" w:hAnsi="Calibri" w:cs="Calibri"/>
+          <w:b/>
+          <w:sz w:val="36"/>
+          <w:szCs w:val="36"/>
+        </w:rPr>
+        <w:t>Explicação da Parte 6 – Leituras acima de um limite</w:t>
+      </w:r>
+    </w:p>
+    <w:p>
+      <w:pPr>
+        <w:rPr>
+          <w:rFonts w:cs="Calibri"/>
+        </w:rPr>
+      </w:pPr>
+      <w:r>
+        <w:rPr>
+          <w:rFonts w:cs="Calibri"/>
+          <w:b/>
+          <w:bCs/>
+        </w:rPr>
+        <w:t>Por que são necessários loops aninhados?</w:t>
+      </w:r>
+      <w:r>
+        <w:rPr>
+          <w:rFonts w:cs="Calibri"/>
+        </w:rPr>
+        <w:br/>
+        <w:t xml:space="preserve">Os loops aninhados são necessários porque os dados estão organizados em uma matriz bidimensional de sensores e horários. O primeiro </w:t>
+      </w:r>
+      <w:proofErr w:type="gramStart"/>
+      <w:r>
+        <w:rPr>
+          <w:rFonts w:cs="Calibri"/>
+        </w:rPr>
+        <w:t>for, representado</w:t>
+      </w:r>
+      <w:proofErr w:type="gramEnd"/>
+      <w:r>
+        <w:rPr>
+          <w:rFonts w:cs="Calibri"/>
+        </w:rPr>
+        <w:t xml:space="preserve"> pelo índice i, percorre os sensores, enquanto o segundo </w:t>
+      </w:r>
+      <w:proofErr w:type="gramStart"/>
+      <w:r>
+        <w:rPr>
+          <w:rFonts w:cs="Calibri"/>
+        </w:rPr>
+        <w:t>for, representado</w:t>
+      </w:r>
+      <w:proofErr w:type="gramEnd"/>
+      <w:r>
+        <w:rPr>
+          <w:rFonts w:cs="Calibri"/>
+        </w:rPr>
+        <w:t xml:space="preserve"> pelo índice j, percorre as horas de cada sensor. Dessa forma, é possível acessar e verificar cada medição individualmente.</w:t>
+      </w:r>
+    </w:p>
+    <w:p>
+      <w:pPr>
+        <w:rPr>
+          <w:rFonts w:cs="Calibri"/>
+        </w:rPr>
+      </w:pPr>
+      <w:r>
+        <w:rPr>
+          <w:rFonts w:cs="Calibri"/>
+          <w:b/>
+          <w:bCs/>
+        </w:rPr>
+        <w:t>Qual é o papel dos índices [i][j]?</w:t>
+      </w:r>
+      <w:r>
+        <w:rPr>
+          <w:rFonts w:cs="Calibri"/>
+        </w:rPr>
+        <w:br/>
+        <w:t>Os índices [i][j] indicam a posição exata de cada temperatura dentro da matriz. O índice i representa a linha, ou seja, o sensor, enquanto o índice j representa a coluna, correspondente ao horário da medição. Assim, sensores[i][j] permite acessar uma temperatura específica.</w:t>
+      </w:r>
+    </w:p>
+    <w:p>
+      <w:pPr>
+        <w:rPr>
+          <w:rFonts w:cs="Calibri"/>
+        </w:rPr>
+      </w:pPr>
+      <w:r>
+        <w:rPr>
+          <w:rFonts w:cs="Calibri"/>
+          <w:b/>
+          <w:bCs/>
+        </w:rPr>
+        <w:t>Quantas posições da matriz são percorridas?</w:t>
+      </w:r>
+      <w:r>
+        <w:rPr>
+          <w:rFonts w:cs="Calibri"/>
+        </w:rPr>
+        <w:br/>
+        <w:t xml:space="preserve">A matriz possui </w:t>
+      </w:r>
+      <w:r>
+        <w:rPr>
+          <w:rFonts w:cs="Calibri"/>
+          <w:b/>
+          <w:bCs/>
+        </w:rPr>
+        <w:t>5 linhas</w:t>
+      </w:r>
+      <w:r>
+        <w:rPr>
+          <w:rFonts w:cs="Calibri"/>
+        </w:rPr>
+        <w:t xml:space="preserve">, correspondentes aos 5 sensores, e </w:t>
+      </w:r>
+      <w:r>
+        <w:rPr>
+          <w:rFonts w:cs="Calibri"/>
+          <w:b/>
+          <w:bCs/>
+        </w:rPr>
+        <w:t>24 colunas</w:t>
+      </w:r>
+      <w:r>
+        <w:rPr>
+          <w:rFonts w:cs="Calibri"/>
+        </w:rPr>
+        <w:t>, correspondentes às 24 horas do dia. Portanto, são percorridas:</w:t>
+      </w:r>
+    </w:p>
+    <w:p>
+      <w:pPr>
+        <w:rPr>
+          <w:rFonts w:cs="Calibri"/>
+        </w:rPr>
+      </w:pPr>
+      <w:r>
+        <w:rPr>
+          <w:rFonts w:cs="Calibri"/>
+          <w:b/>
+          <w:bCs/>
+        </w:rPr>
+        <w:t>5 × 24 = 120 posições</w:t>
+      </w:r>
+    </w:p>
+    <w:p>
+      <w:pPr>
+        <w:rPr>
+          <w:rFonts w:cs="Calibri"/>
+        </w:rPr>
+      </w:pPr>
+      <w:r>
+        <w:rPr>
+          <w:rFonts w:cs="Calibri"/>
+        </w:rPr>
+        <w:t xml:space="preserve">Isso significa que o programa verifica todas as </w:t>
+      </w:r>
+      <w:r>
+        <w:rPr>
+          <w:rFonts w:cs="Calibri"/>
+          <w:b/>
+          <w:bCs/>
+        </w:rPr>
+        <w:t>120 medições de temperatura</w:t>
+      </w:r>
+      <w:r>
+        <w:rPr>
+          <w:rFonts w:cs="Calibri"/>
+        </w:rPr>
+        <w:t xml:space="preserve"> para descobrir quantas estão acima do limite informado pelo usuário.</w:t>
+      </w:r>
+    </w:p>
+    <w:p>
+      <w:pPr>
+        <w:rPr>
+          <w:rFonts w:cs="Calibri"/>
+        </w:rPr>
+      </w:pPr>
+      <w:r>
+        <w:rPr>
+          <w:rFonts w:cs="Calibri"/>
+          <w:b/>
+          <w:bCs/>
+        </w:rPr>
+        <w:t>Qual é a relação entre o número de linhas, colunas e quantidade de operações?</w:t>
+      </w:r>
+      <w:r>
+        <w:rPr>
+          <w:rFonts w:cs="Calibri"/>
+        </w:rPr>
+        <w:br/>
+        <w:t xml:space="preserve">A quantidade de posições percorridas é determinada pela multiplicação entre o número de linhas e o número de colunas. Considerando m linhas e n colunas, o algoritmo pode precisar percorrer </w:t>
+      </w:r>
+      <w:r>
+        <w:rPr>
+          <w:rFonts w:cs="Calibri"/>
+          <w:b/>
+          <w:bCs/>
+        </w:rPr>
+        <w:t>m × n posições</w:t>
+      </w:r>
+      <w:r>
+        <w:rPr>
+          <w:rFonts w:cs="Calibri"/>
+        </w:rPr>
+        <w:t xml:space="preserve">. Portanto, se aumentarmos a </w:t>
+      </w:r>
+      <w:r>
+        <w:rPr>
+          <w:rFonts w:cs="Calibri"/>
+        </w:rPr>
+        <w:lastRenderedPageBreak/>
+        <w:t xml:space="preserve">quantidade de sensores ou de horários, a quantidade de operações também aumenta proporcionalmente. A complexidade desse percurso é </w:t>
+      </w:r>
+      <w:proofErr w:type="gramStart"/>
+      <w:r>
+        <w:rPr>
+          <w:rFonts w:cs="Calibri"/>
+          <w:b/>
+          <w:bCs/>
+        </w:rPr>
+        <w:t>O(</w:t>
+      </w:r>
+      <w:proofErr w:type="gramEnd"/>
+      <w:r>
+        <w:rPr>
+          <w:rFonts w:cs="Calibri"/>
+          <w:b/>
+          <w:bCs/>
+        </w:rPr>
+        <w:t>m × n)</w:t>
+      </w:r>
+      <w:r>
+        <w:rPr>
+          <w:rFonts w:cs="Calibri"/>
+        </w:rPr>
+        <w:t xml:space="preserve">. </w:t>
+      </w:r>
+    </w:p>
+    <w:p>
+      <w:pPr>
+        <w:rPr>
+          <w:rFonts w:cs="Calibri"/>
+        </w:rPr>
+      </w:pPr>
+    </w:p>
+    <w:p>
+      <w:pPr>
+        <w:rPr>
+          <w:rFonts w:ascii="Calibri" w:hAnsi="Calibri" w:cs="Calibri"/>
+          <w:b/>
+          <w:bCs/>
+          <w:sz w:val="36"/>
+          <w:szCs w:val="36"/>
+        </w:rPr>
+      </w:pPr>
+      <w:r>
+        <w:rPr>
+          <w:rFonts w:ascii="Calibri" w:hAnsi="Calibri" w:cs="Calibri"/>
+          <w:b/>
+          <w:bCs/>
+          <w:sz w:val="36"/>
+          <w:szCs w:val="36"/>
+        </w:rPr>
+        <w:t>PARTE 6 – ANÁLISE E CONCLUSÃO</w:t>
+      </w:r>
+    </w:p>
+    <w:p>
+      <w:pPr>
+        <w:rPr>
+          <w:rFonts w:cs="Calibri"/>
+        </w:rPr>
+      </w:pPr>
+      <w:r>
+        <w:rPr>
+          <w:rFonts w:cs="Calibri"/>
+        </w:rPr>
+        <w:t xml:space="preserve">Os experimentos realizados permitiram observar, na prática, como o tamanho das estruturas de dados influencia diretamente a quantidade de operações executadas pelos algoritmos. Tanto nos testes de ordenação quanto nos percursos de </w:t>
+      </w:r>
+      <w:proofErr w:type="spellStart"/>
+      <w:r>
+        <w:rPr>
+          <w:rFonts w:cs="Calibri"/>
+        </w:rPr>
+        <w:t>arrays</w:t>
+      </w:r>
+      <w:proofErr w:type="spellEnd"/>
+      <w:r>
+        <w:rPr>
+          <w:rFonts w:cs="Calibri"/>
+        </w:rPr>
+        <w:t xml:space="preserve"> e matrizes, estruturas maiores exigiram uma quantidade maior de comparações, acessos e movimentações.</w:t>
+      </w:r>
+    </w:p>
+    <w:p>
+      <w:pPr>
+        <w:rPr>
+          <w:rFonts w:cs="Calibri"/>
+          <w:b/>
+          <w:bCs/>
+        </w:rPr>
+      </w:pPr>
+      <w:r>
+        <w:rPr>
+          <w:rFonts w:cs="Calibri"/>
+          <w:b/>
+          <w:bCs/>
+        </w:rPr>
+        <w:t>1. O aumento do tamanho da estrutura de dados influencia a quantidade de operações?</w:t>
+      </w:r>
+    </w:p>
+    <w:p>
+      <w:pPr>
+        <w:rPr>
+          <w:rFonts w:cs="Calibri"/>
+        </w:rPr>
+      </w:pPr>
+      <w:r>
+        <w:rPr>
+          <w:rFonts w:cs="Calibri"/>
+        </w:rPr>
+        <w:t>Sim. Quanto maior for a quantidade de elementos, maior tende a ser a quantidade de operações necessárias para processar a estrutura. Por exemplo, em uma matriz com m linhas e n colunas, um percurso completo precisa acessar m × n posições. Da mesma forma, nos algoritmos de ordenação, o aumento do número de elementos provoca um crescimento na quantidade de comparações e movimentações.</w:t>
+      </w:r>
+    </w:p>
+    <w:p>
+      <w:pPr>
+        <w:rPr>
+          <w:rFonts w:cs="Calibri"/>
+        </w:rPr>
+      </w:pPr>
+      <w:r>
+        <w:rPr>
+          <w:rFonts w:cs="Calibri"/>
+        </w:rPr>
+        <w:t xml:space="preserve">Os experimentos com </w:t>
+      </w:r>
+      <w:proofErr w:type="spellStart"/>
+      <w:r>
+        <w:rPr>
+          <w:rFonts w:cs="Calibri"/>
+        </w:rPr>
+        <w:t>arrays</w:t>
+      </w:r>
+      <w:proofErr w:type="spellEnd"/>
+      <w:r>
+        <w:rPr>
+          <w:rFonts w:cs="Calibri"/>
+        </w:rPr>
+        <w:t xml:space="preserve"> de 10, 20 e 1.000 elementos mostraram claramente essa diferença. Ao aumentar o tamanho do </w:t>
+      </w:r>
+      <w:proofErr w:type="spellStart"/>
+      <w:r>
+        <w:rPr>
+          <w:rFonts w:cs="Calibri"/>
+        </w:rPr>
+        <w:t>array</w:t>
+      </w:r>
+      <w:proofErr w:type="spellEnd"/>
+      <w:r>
+        <w:rPr>
+          <w:rFonts w:cs="Calibri"/>
+        </w:rPr>
+        <w:t xml:space="preserve">, o número de operações também aumentou, porém cada algoritmo apresentou um ritmo de crescimento diferente. </w:t>
+      </w:r>
+    </w:p>
+    <w:p>
+      <w:pPr>
+        <w:rPr>
+          <w:rFonts w:cs="Calibri"/>
+          <w:b/>
+          <w:bCs/>
+        </w:rPr>
+      </w:pPr>
+      <w:r>
+        <w:rPr>
+          <w:rFonts w:cs="Calibri"/>
+          <w:b/>
+          <w:bCs/>
+        </w:rPr>
+        <w:t xml:space="preserve">2. Bubble </w:t>
+      </w:r>
+      <w:proofErr w:type="spellStart"/>
+      <w:r>
+        <w:rPr>
+          <w:rFonts w:cs="Calibri"/>
+          <w:b/>
+          <w:bCs/>
+        </w:rPr>
+        <w:t>Sort</w:t>
+      </w:r>
+      <w:proofErr w:type="spellEnd"/>
+      <w:r>
+        <w:rPr>
+          <w:rFonts w:cs="Calibri"/>
+          <w:b/>
+          <w:bCs/>
+        </w:rPr>
+        <w:t xml:space="preserve"> e Quick </w:t>
+      </w:r>
+      <w:proofErr w:type="spellStart"/>
+      <w:r>
+        <w:rPr>
+          <w:rFonts w:cs="Calibri"/>
+          <w:b/>
+          <w:bCs/>
+        </w:rPr>
+        <w:t>Sort</w:t>
+      </w:r>
+      <w:proofErr w:type="spellEnd"/>
+      <w:r>
+        <w:rPr>
+          <w:rFonts w:cs="Calibri"/>
+          <w:b/>
+          <w:bCs/>
+        </w:rPr>
+        <w:t xml:space="preserve"> crescem da mesma maneira quando o número de elementos aumenta?</w:t>
+      </w:r>
+    </w:p>
+    <w:p>
+      <w:pPr>
+        <w:rPr>
+          <w:rFonts w:cs="Calibri"/>
+        </w:rPr>
+      </w:pPr>
+      <w:r>
+        <w:rPr>
+          <w:rFonts w:cs="Calibri"/>
+        </w:rPr>
+        <w:t>Não. Os dois algoritmos apresentam comportamentos diferentes conforme a quantidade de elementos aumenta.</w:t>
+      </w:r>
+    </w:p>
+    <w:p>
+      <w:pPr>
+        <w:rPr>
+          <w:rFonts w:cs="Calibri"/>
+        </w:rPr>
+      </w:pPr>
+      <w:r>
+        <w:rPr>
+          <w:rFonts w:cs="Calibri"/>
+        </w:rPr>
+        <w:t xml:space="preserve">O Bubble </w:t>
+      </w:r>
+      <w:proofErr w:type="spellStart"/>
+      <w:r>
+        <w:rPr>
+          <w:rFonts w:cs="Calibri"/>
+        </w:rPr>
+        <w:t>Sort</w:t>
+      </w:r>
+      <w:proofErr w:type="spellEnd"/>
+      <w:r>
+        <w:rPr>
+          <w:rFonts w:cs="Calibri"/>
+        </w:rPr>
+        <w:t xml:space="preserve"> possui crescimento quadrático, representado por O(n²). Isso significa que, quando o tamanho da entrada aumenta, a quantidade de comparações pode crescer muito rapidamente. Nos experimentos, para 1.000 elementos, foram registradas 499.500 comparações, demonstrando esse crescimento elevado.</w:t>
+      </w:r>
+    </w:p>
+    <w:p>
+      <w:pPr>
+        <w:rPr>
+          <w:rFonts w:cs="Calibri"/>
+        </w:rPr>
+      </w:pPr>
+      <w:r>
+        <w:rPr>
+          <w:rFonts w:cs="Calibri"/>
+        </w:rPr>
+        <w:t xml:space="preserve">Já o Quick </w:t>
+      </w:r>
+      <w:proofErr w:type="spellStart"/>
+      <w:r>
+        <w:rPr>
+          <w:rFonts w:cs="Calibri"/>
+        </w:rPr>
+        <w:t>Sort</w:t>
+      </w:r>
+      <w:proofErr w:type="spellEnd"/>
+      <w:r>
+        <w:rPr>
+          <w:rFonts w:cs="Calibri"/>
+        </w:rPr>
+        <w:t xml:space="preserve">, em condições médias favoráveis, apresenta complexidade aproximada de </w:t>
+      </w:r>
+      <w:proofErr w:type="gramStart"/>
+      <w:r>
+        <w:rPr>
+          <w:rFonts w:cs="Calibri"/>
+        </w:rPr>
+        <w:t>O(</w:t>
+      </w:r>
+      <w:proofErr w:type="gramEnd"/>
+      <w:r>
+        <w:rPr>
+          <w:rFonts w:cs="Calibri"/>
+        </w:rPr>
+        <w:t xml:space="preserve">n log n). Por isso, mesmo com o aumento significativo da quantidade de elementos, seu número de operações cresce de maneira muito mais controlada. No experimento com 1.000 elementos, o Quick </w:t>
+      </w:r>
+      <w:proofErr w:type="spellStart"/>
+      <w:r>
+        <w:rPr>
+          <w:rFonts w:cs="Calibri"/>
+        </w:rPr>
+        <w:t>Sort</w:t>
+      </w:r>
+      <w:proofErr w:type="spellEnd"/>
+      <w:r>
+        <w:rPr>
+          <w:rFonts w:cs="Calibri"/>
+        </w:rPr>
+        <w:t xml:space="preserve"> realizou 10.982 comparações, uma quantidade muito menor que a do Bubble </w:t>
+      </w:r>
+      <w:proofErr w:type="spellStart"/>
+      <w:r>
+        <w:rPr>
+          <w:rFonts w:cs="Calibri"/>
+        </w:rPr>
+        <w:t>Sort</w:t>
+      </w:r>
+      <w:proofErr w:type="spellEnd"/>
+      <w:r>
+        <w:rPr>
+          <w:rFonts w:cs="Calibri"/>
+        </w:rPr>
+        <w:t xml:space="preserve">. </w:t>
+      </w:r>
+    </w:p>
+    <w:p>
+      <w:pPr>
+        <w:rPr>
+          <w:rFonts w:cs="Calibri"/>
+        </w:rPr>
+      </w:pPr>
+      <w:r>
+        <w:rPr>
+          <w:rFonts w:cs="Calibri"/>
+        </w:rPr>
+        <w:lastRenderedPageBreak/>
+        <w:t>Portanto, quanto maior a estrutura de dados, mais evidente se torna a diferença de eficiência entre os dois algoritmos.</w:t>
+      </w:r>
+    </w:p>
+    <w:p>
+      <w:pPr>
+        <w:rPr>
+          <w:rFonts w:cs="Calibri"/>
+          <w:b/>
+          <w:bCs/>
+        </w:rPr>
+      </w:pPr>
+      <w:r>
+        <w:rPr>
+          <w:rFonts w:cs="Calibri"/>
+          <w:b/>
+          <w:bCs/>
+        </w:rPr>
+        <w:t>3. Por que analisar somente o resultado final da ordenação não é suficiente para comparar algoritmos?</w:t>
+      </w:r>
+    </w:p>
+    <w:p>
+      <w:pPr>
+        <w:rPr>
+          <w:rFonts w:cs="Calibri"/>
+        </w:rPr>
+      </w:pPr>
+      <w:r>
+        <w:rPr>
+          <w:rFonts w:cs="Calibri"/>
+        </w:rPr>
+        <w:t>Analisar apenas o resultado final não é suficiente porque ambos os algoritmos podem produzir corretamente a mesma lista ordenada. Se observarmos somente o resultado, parecerá que os dois tiveram o mesmo desempenho, pois chegaram à mesma solução.</w:t>
+      </w:r>
+    </w:p>
+    <w:p>
+      <w:pPr>
+        <w:rPr>
+          <w:rFonts w:cs="Calibri"/>
+        </w:rPr>
+      </w:pPr>
+      <w:r>
+        <w:rPr>
+          <w:rFonts w:cs="Calibri"/>
+        </w:rPr>
+        <w:t>A principal diferença está em como cada algoritmo chega ao resultado. Para isso, é necessário analisar fatores como:</w:t>
+      </w:r>
+    </w:p>
+    <w:p>
+      <w:pPr>
+        <w:numPr>
+          <w:ilvl w:val="0"/>
+          <w:numId w:val="7"/>
+        </w:numPr>
+        <w:rPr>
+          <w:rFonts w:cs="Calibri"/>
+        </w:rPr>
+      </w:pPr>
+      <w:r>
+        <w:rPr>
+          <w:rFonts w:cs="Calibri"/>
+        </w:rPr>
+        <w:t xml:space="preserve">quantidade de comparações; </w:t>
+      </w:r>
+    </w:p>
+    <w:p>
+      <w:pPr>
+        <w:numPr>
+          <w:ilvl w:val="0"/>
+          <w:numId w:val="7"/>
+        </w:numPr>
+        <w:rPr>
+          <w:rFonts w:cs="Calibri"/>
+        </w:rPr>
+      </w:pPr>
+      <w:r>
+        <w:rPr>
+          <w:rFonts w:cs="Calibri"/>
+        </w:rPr>
+        <w:t xml:space="preserve">quantidade de trocas ou movimentações; </w:t>
+      </w:r>
+    </w:p>
+    <w:p>
+      <w:pPr>
+        <w:numPr>
+          <w:ilvl w:val="0"/>
+          <w:numId w:val="7"/>
+        </w:numPr>
+        <w:rPr>
+          <w:rFonts w:cs="Calibri"/>
+        </w:rPr>
+      </w:pPr>
+      <w:r>
+        <w:rPr>
+          <w:rFonts w:cs="Calibri"/>
+        </w:rPr>
+        <w:t xml:space="preserve">crescimento do número de operações conforme a entrada aumenta; </w:t>
+      </w:r>
+    </w:p>
+    <w:p>
+      <w:pPr>
+        <w:numPr>
+          <w:ilvl w:val="0"/>
+          <w:numId w:val="7"/>
+        </w:numPr>
+        <w:rPr>
+          <w:rFonts w:cs="Calibri"/>
+        </w:rPr>
+      </w:pPr>
+      <w:r>
+        <w:rPr>
+          <w:rFonts w:cs="Calibri"/>
+        </w:rPr>
+        <w:t xml:space="preserve">tempo necessário para processar estruturas maiores; </w:t>
+      </w:r>
+    </w:p>
+    <w:p>
+      <w:pPr>
+        <w:numPr>
+          <w:ilvl w:val="0"/>
+          <w:numId w:val="7"/>
+        </w:numPr>
+        <w:rPr>
+          <w:rFonts w:cs="Calibri"/>
+        </w:rPr>
+      </w:pPr>
+      <w:r>
+        <w:rPr>
+          <w:rFonts w:cs="Calibri"/>
+        </w:rPr>
+        <w:t xml:space="preserve">complexidade do algoritmo. </w:t>
+      </w:r>
+    </w:p>
+    <w:p>
+      <w:pPr>
+        <w:rPr>
+          <w:rFonts w:cs="Calibri"/>
+        </w:rPr>
+      </w:pPr>
+      <w:r>
+        <w:rPr>
+          <w:rFonts w:cs="Calibri"/>
+        </w:rPr>
+        <w:t xml:space="preserve">Dessa forma, a análise das operações permite verificar qual algoritmo é mais eficiente. Nos experimentos realizados, tanto o Bubble </w:t>
+      </w:r>
+      <w:proofErr w:type="spellStart"/>
+      <w:r>
+        <w:rPr>
+          <w:rFonts w:cs="Calibri"/>
+        </w:rPr>
+        <w:t>Sort</w:t>
+      </w:r>
+      <w:proofErr w:type="spellEnd"/>
+      <w:r>
+        <w:rPr>
+          <w:rFonts w:cs="Calibri"/>
+        </w:rPr>
+        <w:t xml:space="preserve"> quanto o Quick </w:t>
+      </w:r>
+      <w:proofErr w:type="spellStart"/>
+      <w:r>
+        <w:rPr>
+          <w:rFonts w:cs="Calibri"/>
+        </w:rPr>
+        <w:t>Sort</w:t>
+      </w:r>
+      <w:proofErr w:type="spellEnd"/>
+      <w:r>
+        <w:rPr>
+          <w:rFonts w:cs="Calibri"/>
+        </w:rPr>
+        <w:t xml:space="preserve"> ordenaram corretamente os dados, mas o Quick </w:t>
+      </w:r>
+      <w:proofErr w:type="spellStart"/>
+      <w:r>
+        <w:rPr>
+          <w:rFonts w:cs="Calibri"/>
+        </w:rPr>
+        <w:t>Sort</w:t>
+      </w:r>
+      <w:proofErr w:type="spellEnd"/>
+      <w:r>
+        <w:rPr>
+          <w:rFonts w:cs="Calibri"/>
+        </w:rPr>
+        <w:t xml:space="preserve"> precisou de muito menos operações, principalmente quando o </w:t>
+      </w:r>
+      <w:proofErr w:type="spellStart"/>
+      <w:r>
+        <w:rPr>
+          <w:rFonts w:cs="Calibri"/>
+        </w:rPr>
+        <w:t>array</w:t>
+      </w:r>
+      <w:proofErr w:type="spellEnd"/>
+      <w:r>
+        <w:rPr>
+          <w:rFonts w:cs="Calibri"/>
+        </w:rPr>
+        <w:t xml:space="preserve"> aumentou para 1.000 elementos. </w:t>
+      </w:r>
+    </w:p>
+    <w:p>
+      <w:pPr>
+        <w:rPr>
+          <w:rFonts w:ascii="Calibri" w:hAnsi="Calibri" w:cs="Calibri"/>
+          <w:b/>
+          <w:bCs/>
+          <w:sz w:val="36"/>
+          <w:szCs w:val="36"/>
+        </w:rPr>
+      </w:pPr>
+      <w:r>
+        <w:rPr>
+          <w:rFonts w:ascii="Calibri" w:hAnsi="Calibri" w:cs="Calibri"/>
+          <w:b/>
+          <w:bCs/>
+          <w:sz w:val="36"/>
+          <w:szCs w:val="36"/>
+        </w:rPr>
+        <w:t>Conclusão Geral</w:t>
+      </w:r>
+    </w:p>
+    <w:p>
+      <w:pPr>
+        <w:rPr>
+          <w:rFonts w:cs="Calibri"/>
+        </w:rPr>
+      </w:pPr>
+      <w:r>
+        <w:rPr>
+          <w:rFonts w:cs="Calibri"/>
+        </w:rPr>
+        <w:t>Conclui-se que a escolha de um algoritmo é muito importante, principalmente quando se trabalha com grandes quantidades de dados. Os experimentos demonstraram que o aumento do tamanho das estruturas influencia diretamente a quantidade de operações necessárias.</w:t>
+      </w:r>
+    </w:p>
+    <w:p>
+      <w:pPr>
+        <w:rPr>
+          <w:rFonts w:cs="Calibri"/>
+        </w:rPr>
+      </w:pPr>
+      <w:r>
+        <w:rPr>
+          <w:rFonts w:cs="Calibri"/>
+        </w:rPr>
+        <w:t xml:space="preserve">O Bubble </w:t>
+      </w:r>
+      <w:proofErr w:type="spellStart"/>
+      <w:r>
+        <w:rPr>
+          <w:rFonts w:cs="Calibri"/>
+        </w:rPr>
+        <w:t>Sort</w:t>
+      </w:r>
+      <w:proofErr w:type="spellEnd"/>
+      <w:r>
+        <w:rPr>
+          <w:rFonts w:cs="Calibri"/>
+        </w:rPr>
+        <w:t xml:space="preserve">, apesar de simples e fácil de entender, apresenta um crescimento muito elevado na quantidade de operações, tornando-se pouco eficiente para grandes volumes de dados. Por outro lado, o Quick </w:t>
+      </w:r>
+      <w:proofErr w:type="spellStart"/>
+      <w:r>
+        <w:rPr>
+          <w:rFonts w:cs="Calibri"/>
+        </w:rPr>
+        <w:t>Sort</w:t>
+      </w:r>
+      <w:proofErr w:type="spellEnd"/>
+      <w:r>
+        <w:rPr>
+          <w:rFonts w:cs="Calibri"/>
+        </w:rPr>
+        <w:t xml:space="preserve"> apresentou um desempenho muito melhor nos testes, pois utiliza uma estratégia de divisão do problema em partes menores.</w:t>
+      </w:r>
+    </w:p>
+    <w:p>
+      <w:pPr>
+        <w:rPr>
+          <w:rFonts w:cs="Calibri"/>
+        </w:rPr>
+      </w:pPr>
+      <w:r>
+        <w:rPr>
+          <w:rFonts w:cs="Calibri"/>
+        </w:rPr>
+        <w:t xml:space="preserve">Além disso, os exercícios com </w:t>
+      </w:r>
+      <w:proofErr w:type="spellStart"/>
+      <w:r>
+        <w:rPr>
+          <w:rFonts w:cs="Calibri"/>
+        </w:rPr>
+        <w:t>arrays</w:t>
+      </w:r>
+      <w:proofErr w:type="spellEnd"/>
+      <w:r>
+        <w:rPr>
+          <w:rFonts w:cs="Calibri"/>
+        </w:rPr>
+        <w:t xml:space="preserve"> e matrizes mostraram que a organização dos dados também influencia o processamento. Em </w:t>
+      </w:r>
+      <w:proofErr w:type="spellStart"/>
+      <w:r>
+        <w:rPr>
+          <w:rFonts w:cs="Calibri"/>
+        </w:rPr>
+        <w:t>arrays</w:t>
+      </w:r>
+      <w:proofErr w:type="spellEnd"/>
+      <w:r>
+        <w:rPr>
+          <w:rFonts w:cs="Calibri"/>
+        </w:rPr>
+        <w:t xml:space="preserve">, percursos simples apresentam crescimento linear O(n), enquanto em matrizes o número de operações depende da quantidade de linhas multiplicada pela quantidade de colunas, resultando em </w:t>
+      </w:r>
+      <w:proofErr w:type="gramStart"/>
+      <w:r>
+        <w:rPr>
+          <w:rFonts w:cs="Calibri"/>
+        </w:rPr>
+        <w:t>O(</w:t>
+      </w:r>
+      <w:proofErr w:type="gramEnd"/>
+      <w:r>
+        <w:rPr>
+          <w:rFonts w:cs="Calibri"/>
+        </w:rPr>
+        <w:t>m × n).</w:t>
+      </w:r>
+    </w:p>
+    <w:p>
+      <w:pPr>
+        <w:rPr>
+          <w:rFonts w:cs="Calibri"/>
+        </w:rPr>
+      </w:pPr>
+      <w:r>
+        <w:rPr>
+          <w:rFonts w:cs="Calibri"/>
+        </w:rPr>
+        <w:lastRenderedPageBreak/>
+        <w:t>Assim, a realização dos experimentos foi importante para comprovar que não basta um algoritmo produzir o resultado correto: também é necessário analisar a quantidade de operações e a forma como seu desempenho cresce conforme o volume de dados aumenta.</w:t>
+      </w:r>
+    </w:p>
+    <w:p>
+      <w:pPr>
+        <w:rPr>
+          <w:rFonts w:ascii="Calibri" w:hAnsi="Calibri" w:cs="Calibri"/>
+          <w:b/>
+          <w:bCs/>
+          <w:sz w:val="36"/>
+          <w:szCs w:val="36"/>
+        </w:rPr>
+      </w:pPr>
+    </w:p>
     <w:sectPr>
       <w:pgSz w:w="11906" w:h="16838"/>
       <w:pgMar w:top="1417" w:right="1701" w:bottom="1417" w:left="1701" w:header="708" w:footer="708" w:gutter="0"/>
@@ -2953,6 +5487,119 @@
     </w:lvl>
   </w:abstractNum>
   <w:abstractNum w:abstractNumId="1" w15:restartNumberingAfterBreak="0">
+    <w:nsid w:val="21B00556"/>
+    <w:multiLevelType w:val="multilevel"/>
+    <w:tmpl w:val="AD72A534"/>
+    <w:lvl w:ilvl="0">
+      <w:start w:val="1"/>
+      <w:numFmt w:val="decimal"/>
+      <w:lvlText w:val="%1."/>
+      <w:lvlJc w:val="left"/>
+      <w:pPr>
+        <w:tabs>
+          <w:tab w:val="num" w:pos="720"/>
+        </w:tabs>
+        <w:ind w:left="720" w:hanging="360"/>
+      </w:pPr>
+    </w:lvl>
+    <w:lvl w:ilvl="1" w:tentative="1">
+      <w:start w:val="1"/>
+      <w:numFmt w:val="decimal"/>
+      <w:lvlText w:val="%2."/>
+      <w:lvlJc w:val="left"/>
+      <w:pPr>
+        <w:tabs>
+          <w:tab w:val="num" w:pos="1440"/>
+        </w:tabs>
+        <w:ind w:left="1440" w:hanging="360"/>
+      </w:pPr>
+    </w:lvl>
+    <w:lvl w:ilvl="2" w:tentative="1">
+      <w:start w:val="1"/>
+      <w:numFmt w:val="decimal"/>
+      <w:lvlText w:val="%3."/>
+      <w:lvlJc w:val="left"/>
+      <w:pPr>
+        <w:tabs>
+          <w:tab w:val="num" w:pos="2160"/>
+        </w:tabs>
+        <w:ind w:left="2160" w:hanging="360"/>
+      </w:pPr>
+    </w:lvl>
+    <w:lvl w:ilvl="3" w:tentative="1">
+      <w:start w:val="1"/>
+      <w:numFmt w:val="decimal"/>
+      <w:lvlText w:val="%4."/>
+      <w:lvlJc w:val="left"/>
+      <w:pPr>
+        <w:tabs>
+          <w:tab w:val="num" w:pos="2880"/>
+        </w:tabs>
+        <w:ind w:left="2880" w:hanging="360"/>
+      </w:pPr>
+    </w:lvl>
+    <w:lvl w:ilvl="4" w:tentative="1">
+      <w:start w:val="1"/>
+      <w:numFmt w:val="decimal"/>
+      <w:lvlText w:val="%5."/>
+      <w:lvlJc w:val="left"/>
+      <w:pPr>
+        <w:tabs>
+          <w:tab w:val="num" w:pos="3600"/>
+        </w:tabs>
+        <w:ind w:left="3600" w:hanging="360"/>
+      </w:pPr>
+    </w:lvl>
+    <w:lvl w:ilvl="5" w:tentative="1">
+      <w:start w:val="1"/>
+      <w:numFmt w:val="decimal"/>
+      <w:lvlText w:val="%6."/>
+      <w:lvlJc w:val="left"/>
+      <w:pPr>
+        <w:tabs>
+          <w:tab w:val="num" w:pos="4320"/>
+        </w:tabs>
+        <w:ind w:left="4320" w:hanging="360"/>
+      </w:pPr>
+    </w:lvl>
+    <w:lvl w:ilvl="6" w:tentative="1">
+      <w:start w:val="1"/>
+      <w:numFmt w:val="decimal"/>
+      <w:lvlText w:val="%7."/>
+      <w:lvlJc w:val="left"/>
+      <w:pPr>
+        <w:tabs>
+          <w:tab w:val="num" w:pos="5040"/>
+        </w:tabs>
+        <w:ind w:left="5040" w:hanging="360"/>
+      </w:pPr>
+    </w:lvl>
+    <w:lvl w:ilvl="7" w:tentative="1">
+      <w:start w:val="1"/>
+      <w:numFmt w:val="decimal"/>
+      <w:lvlText w:val="%8."/>
+      <w:lvlJc w:val="left"/>
+      <w:pPr>
+        <w:tabs>
+          <w:tab w:val="num" w:pos="5760"/>
+        </w:tabs>
+        <w:ind w:left="5760" w:hanging="360"/>
+      </w:pPr>
+    </w:lvl>
+    <w:lvl w:ilvl="8" w:tentative="1">
+      <w:start w:val="1"/>
+      <w:numFmt w:val="decimal"/>
+      <w:lvlText w:val="%9."/>
+      <w:lvlJc w:val="left"/>
+      <w:pPr>
+        <w:tabs>
+          <w:tab w:val="num" w:pos="6480"/>
+        </w:tabs>
+        <w:ind w:left="6480" w:hanging="360"/>
+      </w:pPr>
+    </w:lvl>
+  </w:abstractNum>
+  <w:abstractNum w:abstractNumId="2" w15:restartNumberingAfterBreak="0">
     <w:nsid w:val="2C4A4683"/>
     <w:multiLevelType w:val="multilevel"/>
     <w:tmpl w:val="870C3FC4"/>
@@ -3101,10 +5748,10 @@
       </w:rPr>
     </w:lvl>
   </w:abstractNum>
-  <w:abstractNum w:abstractNumId="2" w15:restartNumberingAfterBreak="0">
-    <w:nsid w:val="628544D1"/>
+  <w:abstractNum w:abstractNumId="3" w15:restartNumberingAfterBreak="0">
+    <w:nsid w:val="4C341D29"/>
     <w:multiLevelType w:val="multilevel"/>
-    <w:tmpl w:val="9CF02F12"/>
+    <w:tmpl w:val="E83CFD2A"/>
     <w:lvl w:ilvl="0">
       <w:start w:val="1"/>
       <w:numFmt w:val="bullet"/>
@@ -3250,123 +5897,10 @@
       </w:rPr>
     </w:lvl>
   </w:abstractNum>
-  <w:abstractNum w:abstractNumId="3" w15:restartNumberingAfterBreak="0">
-    <w:nsid w:val="635F6C7F"/>
+  <w:abstractNum w:abstractNumId="4" w15:restartNumberingAfterBreak="0">
+    <w:nsid w:val="628544D1"/>
     <w:multiLevelType w:val="multilevel"/>
-    <w:tmpl w:val="2990D7A4"/>
-    <w:lvl w:ilvl="0">
-      <w:start w:val="1"/>
-      <w:numFmt w:val="decimal"/>
-      <w:lvlText w:val="%1."/>
-      <w:lvlJc w:val="left"/>
-      <w:pPr>
-        <w:tabs>
-          <w:tab w:val="num" w:pos="720"/>
-        </w:tabs>
-        <w:ind w:left="720" w:hanging="360"/>
-      </w:pPr>
-    </w:lvl>
-    <w:lvl w:ilvl="1" w:tentative="1">
-      <w:start w:val="1"/>
-      <w:numFmt w:val="decimal"/>
-      <w:lvlText w:val="%2."/>
-      <w:lvlJc w:val="left"/>
-      <w:pPr>
-        <w:tabs>
-          <w:tab w:val="num" w:pos="1440"/>
-        </w:tabs>
-        <w:ind w:left="1440" w:hanging="360"/>
-      </w:pPr>
-    </w:lvl>
-    <w:lvl w:ilvl="2" w:tentative="1">
-      <w:start w:val="1"/>
-      <w:numFmt w:val="decimal"/>
-      <w:lvlText w:val="%3."/>
-      <w:lvlJc w:val="left"/>
-      <w:pPr>
-        <w:tabs>
-          <w:tab w:val="num" w:pos="2160"/>
-        </w:tabs>
-        <w:ind w:left="2160" w:hanging="360"/>
-      </w:pPr>
-    </w:lvl>
-    <w:lvl w:ilvl="3" w:tentative="1">
-      <w:start w:val="1"/>
-      <w:numFmt w:val="decimal"/>
-      <w:lvlText w:val="%4."/>
-      <w:lvlJc w:val="left"/>
-      <w:pPr>
-        <w:tabs>
-          <w:tab w:val="num" w:pos="2880"/>
-        </w:tabs>
-        <w:ind w:left="2880" w:hanging="360"/>
-      </w:pPr>
-    </w:lvl>
-    <w:lvl w:ilvl="4" w:tentative="1">
-      <w:start w:val="1"/>
-      <w:numFmt w:val="decimal"/>
-      <w:lvlText w:val="%5."/>
-      <w:lvlJc w:val="left"/>
-      <w:pPr>
-        <w:tabs>
-          <w:tab w:val="num" w:pos="3600"/>
-        </w:tabs>
-        <w:ind w:left="3600" w:hanging="360"/>
-      </w:pPr>
-    </w:lvl>
-    <w:lvl w:ilvl="5" w:tentative="1">
-      <w:start w:val="1"/>
-      <w:numFmt w:val="decimal"/>
-      <w:lvlText w:val="%6."/>
-      <w:lvlJc w:val="left"/>
-      <w:pPr>
-        <w:tabs>
-          <w:tab w:val="num" w:pos="4320"/>
-        </w:tabs>
-        <w:ind w:left="4320" w:hanging="360"/>
-      </w:pPr>
-    </w:lvl>
-    <w:lvl w:ilvl="6" w:tentative="1">
-      <w:start w:val="1"/>
-      <w:numFmt w:val="decimal"/>
-      <w:lvlText w:val="%7."/>
-      <w:lvlJc w:val="left"/>
-      <w:pPr>
-        <w:tabs>
-          <w:tab w:val="num" w:pos="5040"/>
-        </w:tabs>
-        <w:ind w:left="5040" w:hanging="360"/>
-      </w:pPr>
-    </w:lvl>
-    <w:lvl w:ilvl="7" w:tentative="1">
-      <w:start w:val="1"/>
-      <w:numFmt w:val="decimal"/>
-      <w:lvlText w:val="%8."/>
-      <w:lvlJc w:val="left"/>
-      <w:pPr>
-        <w:tabs>
-          <w:tab w:val="num" w:pos="5760"/>
-        </w:tabs>
-        <w:ind w:left="5760" w:hanging="360"/>
-      </w:pPr>
-    </w:lvl>
-    <w:lvl w:ilvl="8" w:tentative="1">
-      <w:start w:val="1"/>
-      <w:numFmt w:val="decimal"/>
-      <w:lvlText w:val="%9."/>
-      <w:lvlJc w:val="left"/>
-      <w:pPr>
-        <w:tabs>
-          <w:tab w:val="num" w:pos="6480"/>
-        </w:tabs>
-        <w:ind w:left="6480" w:hanging="360"/>
-      </w:pPr>
-    </w:lvl>
-  </w:abstractNum>
-  <w:abstractNum w:abstractNumId="4" w15:restartNumberingAfterBreak="0">
-    <w:nsid w:val="78F23680"/>
-    <w:multiLevelType w:val="multilevel"/>
-    <w:tmpl w:val="0E0C2C42"/>
+    <w:tmpl w:val="9CF02F12"/>
     <w:lvl w:ilvl="0">
       <w:start w:val="1"/>
       <w:numFmt w:val="bullet"/>
@@ -3512,20 +6046,288 @@
       </w:rPr>
     </w:lvl>
   </w:abstractNum>
+  <w:abstractNum w:abstractNumId="5" w15:restartNumberingAfterBreak="0">
+    <w:nsid w:val="635F6C7F"/>
+    <w:multiLevelType w:val="multilevel"/>
+    <w:tmpl w:val="2990D7A4"/>
+    <w:lvl w:ilvl="0">
+      <w:start w:val="1"/>
+      <w:numFmt w:val="decimal"/>
+      <w:lvlText w:val="%1."/>
+      <w:lvlJc w:val="left"/>
+      <w:pPr>
+        <w:tabs>
+          <w:tab w:val="num" w:pos="720"/>
+        </w:tabs>
+        <w:ind w:left="720" w:hanging="360"/>
+      </w:pPr>
+    </w:lvl>
+    <w:lvl w:ilvl="1" w:tentative="1">
+      <w:start w:val="1"/>
+      <w:numFmt w:val="decimal"/>
+      <w:lvlText w:val="%2."/>
+      <w:lvlJc w:val="left"/>
+      <w:pPr>
+        <w:tabs>
+          <w:tab w:val="num" w:pos="1440"/>
+        </w:tabs>
+        <w:ind w:left="1440" w:hanging="360"/>
+      </w:pPr>
+    </w:lvl>
+    <w:lvl w:ilvl="2" w:tentative="1">
+      <w:start w:val="1"/>
+      <w:numFmt w:val="decimal"/>
+      <w:lvlText w:val="%3."/>
+      <w:lvlJc w:val="left"/>
+      <w:pPr>
+        <w:tabs>
+          <w:tab w:val="num" w:pos="2160"/>
+        </w:tabs>
+        <w:ind w:left="2160" w:hanging="360"/>
+      </w:pPr>
+    </w:lvl>
+    <w:lvl w:ilvl="3" w:tentative="1">
+      <w:start w:val="1"/>
+      <w:numFmt w:val="decimal"/>
+      <w:lvlText w:val="%4."/>
+      <w:lvlJc w:val="left"/>
+      <w:pPr>
+        <w:tabs>
+          <w:tab w:val="num" w:pos="2880"/>
+        </w:tabs>
+        <w:ind w:left="2880" w:hanging="360"/>
+      </w:pPr>
+    </w:lvl>
+    <w:lvl w:ilvl="4" w:tentative="1">
+      <w:start w:val="1"/>
+      <w:numFmt w:val="decimal"/>
+      <w:lvlText w:val="%5."/>
+      <w:lvlJc w:val="left"/>
+      <w:pPr>
+        <w:tabs>
+          <w:tab w:val="num" w:pos="3600"/>
+        </w:tabs>
+        <w:ind w:left="3600" w:hanging="360"/>
+      </w:pPr>
+    </w:lvl>
+    <w:lvl w:ilvl="5" w:tentative="1">
+      <w:start w:val="1"/>
+      <w:numFmt w:val="decimal"/>
+      <w:lvlText w:val="%6."/>
+      <w:lvlJc w:val="left"/>
+      <w:pPr>
+        <w:tabs>
+          <w:tab w:val="num" w:pos="4320"/>
+        </w:tabs>
+        <w:ind w:left="4320" w:hanging="360"/>
+      </w:pPr>
+    </w:lvl>
+    <w:lvl w:ilvl="6" w:tentative="1">
+      <w:start w:val="1"/>
+      <w:numFmt w:val="decimal"/>
+      <w:lvlText w:val="%7."/>
+      <w:lvlJc w:val="left"/>
+      <w:pPr>
+        <w:tabs>
+          <w:tab w:val="num" w:pos="5040"/>
+        </w:tabs>
+        <w:ind w:left="5040" w:hanging="360"/>
+      </w:pPr>
+    </w:lvl>
+    <w:lvl w:ilvl="7" w:tentative="1">
+      <w:start w:val="1"/>
+      <w:numFmt w:val="decimal"/>
+      <w:lvlText w:val="%8."/>
+      <w:lvlJc w:val="left"/>
+      <w:pPr>
+        <w:tabs>
+          <w:tab w:val="num" w:pos="5760"/>
+        </w:tabs>
+        <w:ind w:left="5760" w:hanging="360"/>
+      </w:pPr>
+    </w:lvl>
+    <w:lvl w:ilvl="8" w:tentative="1">
+      <w:start w:val="1"/>
+      <w:numFmt w:val="decimal"/>
+      <w:lvlText w:val="%9."/>
+      <w:lvlJc w:val="left"/>
+      <w:pPr>
+        <w:tabs>
+          <w:tab w:val="num" w:pos="6480"/>
+        </w:tabs>
+        <w:ind w:left="6480" w:hanging="360"/>
+      </w:pPr>
+    </w:lvl>
+  </w:abstractNum>
+  <w:abstractNum w:abstractNumId="6" w15:restartNumberingAfterBreak="0">
+    <w:nsid w:val="78F23680"/>
+    <w:multiLevelType w:val="multilevel"/>
+    <w:tmpl w:val="0E0C2C42"/>
+    <w:lvl w:ilvl="0">
+      <w:start w:val="1"/>
+      <w:numFmt w:val="bullet"/>
+      <w:lvlText w:val=""/>
+      <w:lvlJc w:val="left"/>
+      <w:pPr>
+        <w:tabs>
+          <w:tab w:val="num" w:pos="720"/>
+        </w:tabs>
+        <w:ind w:left="720" w:hanging="360"/>
+      </w:pPr>
+      <w:rPr>
+        <w:rFonts w:ascii="Symbol" w:hAnsi="Symbol" w:hint="default"/>
+        <w:sz w:val="20"/>
+      </w:rPr>
+    </w:lvl>
+    <w:lvl w:ilvl="1" w:tentative="1">
+      <w:start w:val="1"/>
+      <w:numFmt w:val="bullet"/>
+      <w:lvlText w:val="o"/>
+      <w:lvlJc w:val="left"/>
+      <w:pPr>
+        <w:tabs>
+          <w:tab w:val="num" w:pos="1440"/>
+        </w:tabs>
+        <w:ind w:left="1440" w:hanging="360"/>
+      </w:pPr>
+      <w:rPr>
+        <w:rFonts w:ascii="Courier New" w:hAnsi="Courier New" w:hint="default"/>
+        <w:sz w:val="20"/>
+      </w:rPr>
+    </w:lvl>
+    <w:lvl w:ilvl="2" w:tentative="1">
+      <w:start w:val="1"/>
+      <w:numFmt w:val="bullet"/>
+      <w:lvlText w:val=""/>
+      <w:lvlJc w:val="left"/>
+      <w:pPr>
+        <w:tabs>
+          <w:tab w:val="num" w:pos="2160"/>
+        </w:tabs>
+        <w:ind w:left="2160" w:hanging="360"/>
+      </w:pPr>
+      <w:rPr>
+        <w:rFonts w:ascii="Wingdings" w:hAnsi="Wingdings" w:hint="default"/>
+        <w:sz w:val="20"/>
+      </w:rPr>
+    </w:lvl>
+    <w:lvl w:ilvl="3" w:tentative="1">
+      <w:start w:val="1"/>
+      <w:numFmt w:val="bullet"/>
+      <w:lvlText w:val=""/>
+      <w:lvlJc w:val="left"/>
+      <w:pPr>
+        <w:tabs>
+          <w:tab w:val="num" w:pos="2880"/>
+        </w:tabs>
+        <w:ind w:left="2880" w:hanging="360"/>
+      </w:pPr>
+      <w:rPr>
+        <w:rFonts w:ascii="Wingdings" w:hAnsi="Wingdings" w:hint="default"/>
+        <w:sz w:val="20"/>
+      </w:rPr>
+    </w:lvl>
+    <w:lvl w:ilvl="4" w:tentative="1">
+      <w:start w:val="1"/>
+      <w:numFmt w:val="bullet"/>
+      <w:lvlText w:val=""/>
+      <w:lvlJc w:val="left"/>
+      <w:pPr>
+        <w:tabs>
+          <w:tab w:val="num" w:pos="3600"/>
+        </w:tabs>
+        <w:ind w:left="3600" w:hanging="360"/>
+      </w:pPr>
+      <w:rPr>
+        <w:rFonts w:ascii="Wingdings" w:hAnsi="Wingdings" w:hint="default"/>
+        <w:sz w:val="20"/>
+      </w:rPr>
+    </w:lvl>
+    <w:lvl w:ilvl="5" w:tentative="1">
+      <w:start w:val="1"/>
+      <w:numFmt w:val="bullet"/>
+      <w:lvlText w:val=""/>
+      <w:lvlJc w:val="left"/>
+      <w:pPr>
+        <w:tabs>
+          <w:tab w:val="num" w:pos="4320"/>
+        </w:tabs>
+        <w:ind w:left="4320" w:hanging="360"/>
+      </w:pPr>
+      <w:rPr>
+        <w:rFonts w:ascii="Wingdings" w:hAnsi="Wingdings" w:hint="default"/>
+        <w:sz w:val="20"/>
+      </w:rPr>
+    </w:lvl>
+    <w:lvl w:ilvl="6" w:tentative="1">
+      <w:start w:val="1"/>
+      <w:numFmt w:val="bullet"/>
+      <w:lvlText w:val=""/>
+      <w:lvlJc w:val="left"/>
+      <w:pPr>
+        <w:tabs>
+          <w:tab w:val="num" w:pos="5040"/>
+        </w:tabs>
+        <w:ind w:left="5040" w:hanging="360"/>
+      </w:pPr>
+      <w:rPr>
+        <w:rFonts w:ascii="Wingdings" w:hAnsi="Wingdings" w:hint="default"/>
+        <w:sz w:val="20"/>
+      </w:rPr>
+    </w:lvl>
+    <w:lvl w:ilvl="7" w:tentative="1">
+      <w:start w:val="1"/>
+      <w:numFmt w:val="bullet"/>
+      <w:lvlText w:val=""/>
+      <w:lvlJc w:val="left"/>
+      <w:pPr>
+        <w:tabs>
+          <w:tab w:val="num" w:pos="5760"/>
+        </w:tabs>
+        <w:ind w:left="5760" w:hanging="360"/>
+      </w:pPr>
+      <w:rPr>
+        <w:rFonts w:ascii="Wingdings" w:hAnsi="Wingdings" w:hint="default"/>
+        <w:sz w:val="20"/>
+      </w:rPr>
+    </w:lvl>
+    <w:lvl w:ilvl="8" w:tentative="1">
+      <w:start w:val="1"/>
+      <w:numFmt w:val="bullet"/>
+      <w:lvlText w:val=""/>
+      <w:lvlJc w:val="left"/>
+      <w:pPr>
+        <w:tabs>
+          <w:tab w:val="num" w:pos="6480"/>
+        </w:tabs>
+        <w:ind w:left="6480" w:hanging="360"/>
+      </w:pPr>
+      <w:rPr>
+        <w:rFonts w:ascii="Wingdings" w:hAnsi="Wingdings" w:hint="default"/>
+        <w:sz w:val="20"/>
+      </w:rPr>
+    </w:lvl>
+  </w:abstractNum>
   <w:num w:numId="1" w16cid:durableId="393237048">
+    <w:abstractNumId w:val="6"/>
+  </w:num>
+  <w:num w:numId="2" w16cid:durableId="930772346">
+    <w:abstractNumId w:val="5"/>
+  </w:num>
+  <w:num w:numId="3" w16cid:durableId="360253689">
     <w:abstractNumId w:val="4"/>
   </w:num>
-  <w:num w:numId="2" w16cid:durableId="930772346">
-    <w:abstractNumId w:val="3"/>
-  </w:num>
-  <w:num w:numId="3" w16cid:durableId="360253689">
+  <w:num w:numId="4" w16cid:durableId="1743478130">
     <w:abstractNumId w:val="2"/>
-  </w:num>
-  <w:num w:numId="4" w16cid:durableId="1743478130">
-    <w:abstractNumId w:val="1"/>
   </w:num>
   <w:num w:numId="5" w16cid:durableId="1042250569">
     <w:abstractNumId w:val="0"/>
+  </w:num>
+  <w:num w:numId="6" w16cid:durableId="606353571">
+    <w:abstractNumId w:val="1"/>
+  </w:num>
+  <w:num w:numId="7" w16cid:durableId="1780027996">
+    <w:abstractNumId w:val="3"/>
   </w:num>
 </w:numbering>
 </file>

</xml_diff>